<commit_message>
Added a changes in terminagion template
</commit_message>
<xml_diff>
--- a/TerminationTemplate.docx
+++ b/TerminationTemplate.docx
@@ -37,14 +37,12 @@
             <w:tblGrid>
               <w:gridCol w:w="1271"/>
               <w:gridCol w:w="2126"/>
-              <w:gridCol w:w="709"/>
-              <w:gridCol w:w="1276"/>
-              <w:gridCol w:w="389"/>
-              <w:gridCol w:w="1821"/>
+              <w:gridCol w:w="142"/>
+              <w:gridCol w:w="1843"/>
+              <w:gridCol w:w="2210"/>
               <w:gridCol w:w="426"/>
               <w:gridCol w:w="1475"/>
-              <w:gridCol w:w="226"/>
-              <w:gridCol w:w="1475"/>
+              <w:gridCol w:w="1701"/>
             </w:tblGrid>
             <w:tr>
               <w:trPr>
@@ -62,7 +60,7 @@
                   <w:tag w:val="#Nav: Termination_Template/50113"/>
                   <w:id w:val="-260762218"/>
                   <w:placeholder>
-                    <w:docPart w:val="77E3EFD32F06411A94A583EAE440DB2A"/>
+                    <w:docPart w:val="C59D612139C1488BB38C15339E917EED"/>
                   </w:placeholder>
                   <w:dataBinding w:prefixMappings="xmlns:ns0='urn:microsoft-dynamics-nav/reports/Termination_Template/50113/'" w:xpath="/ns0:NavWordReportXmlPart[1]/ns0:FinalCalculation[1]/ns0:CompanyName[1]" w:storeItemID="{5BBF7251-B33A-47F9-BAE4-7493B14D6FF8}"/>
                   <w:text/>
@@ -78,7 +76,6 @@
                       </w:tcBorders>
                     </w:tcPr>
                     <w:p>
-                      <w:proofErr w:type="spellStart"/>
                       <w:r>
                         <w:rPr>
                           <w:b/>
@@ -88,7 +85,6 @@
                         </w:rPr>
                         <w:t>CompanyName</w:t>
                       </w:r>
-                      <w:proofErr w:type="spellEnd"/>
                     </w:p>
                   </w:tc>
                 </w:sdtContent>
@@ -105,7 +101,7 @@
                   <w:tc>
                     <w:tcPr>
                       <w:tcW w:w="5812" w:type="dxa"/>
-                      <w:gridSpan w:val="6"/>
+                      <w:gridSpan w:val="4"/>
                       <w:vMerge w:val="restart"/>
                       <w:tcBorders>
                         <w:left w:val="nil"/>
@@ -126,9 +122,9 @@
                           <w:noProof/>
                         </w:rPr>
                         <w:drawing>
-                          <wp:inline distT="0" distB="0" distL="0" distR="0" wp14:anchorId="644B1B28" wp14:editId="62CD766A">
-                            <wp:extent cx="1135380" cy="1135380"/>
-                            <wp:effectExtent l="0" t="0" r="7620" b="7620"/>
+                          <wp:inline distT="0" distB="0" distL="0" distR="0" wp14:anchorId="644B1B28" wp14:editId="3C9BE43D">
+                            <wp:extent cx="1333500" cy="1333500"/>
+                            <wp:effectExtent l="0" t="0" r="0" b="0"/>
                             <wp:docPr id="1" name="Picture 1"/>
                             <wp:cNvGraphicFramePr>
                               <a:graphicFrameLocks xmlns:a="http://schemas.openxmlformats.org/drawingml/2006/main" noChangeAspect="1"/>
@@ -151,7 +147,7 @@
                                   <pic:spPr bwMode="auto">
                                     <a:xfrm>
                                       <a:off x="0" y="0"/>
-                                      <a:ext cx="1135380" cy="1135380"/>
+                                      <a:ext cx="1333500" cy="1333500"/>
                                     </a:xfrm>
                                     <a:prstGeom prst="rect">
                                       <a:avLst/>
@@ -179,7 +175,7 @@
                   <w:tag w:val="#Nav: Termination_Template/50113"/>
                   <w:id w:val="1335498810"/>
                   <w:placeholder>
-                    <w:docPart w:val="77E3EFD32F06411A94A583EAE440DB2A"/>
+                    <w:docPart w:val="C59D612139C1488BB38C15339E917EED"/>
                   </w:placeholder>
                   <w:dataBinding w:prefixMappings="xmlns:ns0='urn:microsoft-dynamics-nav/reports/Termination_Template/50113/'" w:xpath="/ns0:NavWordReportXmlPart[1]/ns0:FinalCalculation[1]/ns0:CompanyAddress[1]" w:storeItemID="{5BBF7251-B33A-47F9-BAE4-7493B14D6FF8}"/>
                   <w:text/>
@@ -196,11 +192,9 @@
                       </w:tcBorders>
                     </w:tcPr>
                     <w:p>
-                      <w:proofErr w:type="spellStart"/>
                       <w:r>
                         <w:t>CompanyAddress</w:t>
                       </w:r>
-                      <w:proofErr w:type="spellEnd"/>
                     </w:p>
                   </w:tc>
                 </w:sdtContent>
@@ -208,7 +202,7 @@
               <w:tc>
                 <w:tcPr>
                   <w:tcW w:w="5812" w:type="dxa"/>
-                  <w:gridSpan w:val="6"/>
+                  <w:gridSpan w:val="4"/>
                   <w:vMerge/>
                   <w:tcBorders>
                     <w:left w:val="nil"/>
@@ -239,13 +233,12 @@
                       <w:tag w:val="#Nav: Termination_Template/50113"/>
                       <w:id w:val="-1782566021"/>
                       <w:placeholder>
-                        <w:docPart w:val="77E3EFD32F06411A94A583EAE440DB2A"/>
+                        <w:docPart w:val="C59D612139C1488BB38C15339E917EED"/>
                       </w:placeholder>
                       <w:dataBinding w:prefixMappings="xmlns:ns0='urn:microsoft-dynamics-nav/reports/Termination_Template/50113/'" w:xpath="/ns0:NavWordReportXmlPart[1]/ns0:FinalCalculation[1]/ns0:CompanyCity[1]" w:storeItemID="{5BBF7251-B33A-47F9-BAE4-7493B14D6FF8}"/>
                       <w:text/>
                     </w:sdtPr>
                     <w:sdtContent>
-                      <w:proofErr w:type="spellStart"/>
                       <w:r>
                         <w:t>CompanyCity</w:t>
                       </w:r>
@@ -260,7 +253,7 @@
                       <w:tag w:val="#Nav: Termination_Template/50113"/>
                       <w:id w:val="831570912"/>
                       <w:placeholder>
-                        <w:docPart w:val="77E3EFD32F06411A94A583EAE440DB2A"/>
+                        <w:docPart w:val="C59D612139C1488BB38C15339E917EED"/>
                       </w:placeholder>
                       <w:dataBinding w:prefixMappings="xmlns:ns0='urn:microsoft-dynamics-nav/reports/Termination_Template/50113/'" w:xpath="/ns0:NavWordReportXmlPart[1]/ns0:FinalCalculation[1]/ns0:CompanyPostcode[1]" w:storeItemID="{5BBF7251-B33A-47F9-BAE4-7493B14D6FF8}"/>
                       <w:text/>
@@ -269,20 +262,18 @@
                       <w:r>
                         <w:t>CompanyPostcode</w:t>
                       </w:r>
-                      <w:proofErr w:type="spellEnd"/>
                     </w:sdtContent>
                   </w:sdt>
                   <w:r>
                     <w:t xml:space="preserve"> ,</w:t>
                   </w:r>
-                  <w:proofErr w:type="spellStart"/>
                   <w:sdt>
                     <w:sdtPr>
                       <w:alias w:val="#Nav: /FinalCalculation/CompanyCountry"/>
                       <w:tag w:val="#Nav: Termination_Template/50113"/>
                       <w:id w:val="440962214"/>
                       <w:placeholder>
-                        <w:docPart w:val="77E3EFD32F06411A94A583EAE440DB2A"/>
+                        <w:docPart w:val="C59D612139C1488BB38C15339E917EED"/>
                       </w:placeholder>
                       <w:dataBinding w:prefixMappings="xmlns:ns0='urn:microsoft-dynamics-nav/reports/Termination_Template/50113/'" w:xpath="/ns0:NavWordReportXmlPart[1]/ns0:FinalCalculation[1]/ns0:CompanyCountry[1]" w:storeItemID="{5BBF7251-B33A-47F9-BAE4-7493B14D6FF8}"/>
                       <w:text/>
@@ -291,7 +282,6 @@
                       <w:r>
                         <w:t>CompanyCountry</w:t>
                       </w:r>
-                      <w:proofErr w:type="spellEnd"/>
                     </w:sdtContent>
                   </w:sdt>
                 </w:p>
@@ -299,7 +289,7 @@
               <w:tc>
                 <w:tcPr>
                   <w:tcW w:w="5812" w:type="dxa"/>
-                  <w:gridSpan w:val="6"/>
+                  <w:gridSpan w:val="4"/>
                   <w:vMerge/>
                   <w:tcBorders>
                     <w:left w:val="nil"/>
@@ -329,17 +319,15 @@
                       <w:tag w:val="#Nav: Termination_Template/50113"/>
                       <w:id w:val="-399915033"/>
                       <w:placeholder>
-                        <w:docPart w:val="77E3EFD32F06411A94A583EAE440DB2A"/>
+                        <w:docPart w:val="C59D612139C1488BB38C15339E917EED"/>
                       </w:placeholder>
                       <w:dataBinding w:prefixMappings="xmlns:ns0='urn:microsoft-dynamics-nav/reports/Termination_Template/50113/'" w:xpath="/ns0:NavWordReportXmlPart[1]/ns0:FinalCalculation[1]/ns0:CompanyPhone[1]" w:storeItemID="{5BBF7251-B33A-47F9-BAE4-7493B14D6FF8}"/>
                       <w:text/>
                     </w:sdtPr>
                     <w:sdtContent>
-                      <w:proofErr w:type="spellStart"/>
                       <w:r>
                         <w:t>CompanyPhone</w:t>
                       </w:r>
-                      <w:proofErr w:type="spellEnd"/>
                     </w:sdtContent>
                   </w:sdt>
                 </w:p>
@@ -347,7 +335,7 @@
               <w:tc>
                 <w:tcPr>
                   <w:tcW w:w="5812" w:type="dxa"/>
-                  <w:gridSpan w:val="6"/>
+                  <w:gridSpan w:val="4"/>
                   <w:vMerge/>
                   <w:tcBorders>
                     <w:left w:val="nil"/>
@@ -377,17 +365,15 @@
                       <w:tag w:val="#Nav: Termination_Template/50113"/>
                       <w:id w:val="1259637548"/>
                       <w:placeholder>
-                        <w:docPart w:val="77E3EFD32F06411A94A583EAE440DB2A"/>
+                        <w:docPart w:val="C59D612139C1488BB38C15339E917EED"/>
                       </w:placeholder>
                       <w:dataBinding w:prefixMappings="xmlns:ns0='urn:microsoft-dynamics-nav/reports/Termination_Template/50113/'" w:xpath="/ns0:NavWordReportXmlPart[1]/ns0:FinalCalculation[1]/ns0:CompanyEmail[1]" w:storeItemID="{5BBF7251-B33A-47F9-BAE4-7493B14D6FF8}"/>
                       <w:text/>
                     </w:sdtPr>
                     <w:sdtContent>
-                      <w:proofErr w:type="spellStart"/>
                       <w:r>
                         <w:t>CompanyEmail</w:t>
                       </w:r>
-                      <w:proofErr w:type="spellEnd"/>
                     </w:sdtContent>
                   </w:sdt>
                 </w:p>
@@ -395,7 +381,7 @@
               <w:tc>
                 <w:tcPr>
                   <w:tcW w:w="5812" w:type="dxa"/>
-                  <w:gridSpan w:val="6"/>
+                  <w:gridSpan w:val="4"/>
                   <w:vMerge/>
                   <w:tcBorders>
                     <w:left w:val="nil"/>
@@ -420,18 +406,34 @@
                 </w:tcPr>
                 <w:p>
                   <w:r>
-                    <w:t>TRN:</w:t>
-                  </w:r>
+                    <w:t xml:space="preserve">TRN: </w:t>
+                  </w:r>
+                  <w:sdt>
+                    <w:sdtPr>
+                      <w:alias w:val="#Nav: /FinalCalculation/CompanyTRN"/>
+                      <w:tag w:val="#Nav: Termination_Template/50113"/>
+                      <w:id w:val="276291349"/>
+                      <w:placeholder>
+                        <w:docPart w:val="DefaultPlaceholder_-1854013440"/>
+                      </w:placeholder>
+                      <w:dataBinding w:prefixMappings="xmlns:ns0='urn:microsoft-dynamics-nav/reports/Termination_Template/50113/'" w:xpath="/ns0:NavWordReportXmlPart[1]/ns0:FinalCalculation[1]/ns0:CompanyTRN[1]" w:storeItemID="{5BBF7251-B33A-47F9-BAE4-7493B14D6FF8}"/>
+                      <w:text/>
+                    </w:sdtPr>
+                    <w:sdtContent>
+                      <w:r>
+                        <w:t>CompanyTRN</w:t>
+                      </w:r>
+                    </w:sdtContent>
+                  </w:sdt>
                 </w:p>
               </w:tc>
               <w:tc>
                 <w:tcPr>
                   <w:tcW w:w="5812" w:type="dxa"/>
-                  <w:gridSpan w:val="6"/>
+                  <w:gridSpan w:val="4"/>
                   <w:vMerge/>
                   <w:tcBorders>
                     <w:left w:val="nil"/>
-                    <w:bottom w:val="nil"/>
                   </w:tcBorders>
                 </w:tcPr>
                 <w:p/>
@@ -440,10 +442,22 @@
             <w:tr>
               <w:tc>
                 <w:tcPr>
-                  <w:tcW w:w="11194" w:type="dxa"/>
-                  <w:gridSpan w:val="10"/>
+                  <w:tcW w:w="5382" w:type="dxa"/>
+                  <w:gridSpan w:val="4"/>
                   <w:tcBorders>
                     <w:top w:val="nil"/>
+                    <w:right w:val="nil"/>
+                  </w:tcBorders>
+                </w:tcPr>
+                <w:p/>
+              </w:tc>
+              <w:tc>
+                <w:tcPr>
+                  <w:tcW w:w="5812" w:type="dxa"/>
+                  <w:gridSpan w:val="4"/>
+                  <w:vMerge/>
+                  <w:tcBorders>
+                    <w:left w:val="nil"/>
                   </w:tcBorders>
                 </w:tcPr>
                 <w:p/>
@@ -453,7 +467,7 @@
               <w:tc>
                 <w:tcPr>
                   <w:tcW w:w="11194" w:type="dxa"/>
-                  <w:gridSpan w:val="10"/>
+                  <w:gridSpan w:val="8"/>
                   <w:tcBorders>
                     <w:bottom w:val="nil"/>
                   </w:tcBorders>
@@ -482,7 +496,7 @@
               <w:tc>
                 <w:tcPr>
                   <w:tcW w:w="11194" w:type="dxa"/>
-                  <w:gridSpan w:val="10"/>
+                  <w:gridSpan w:val="8"/>
                   <w:tcBorders>
                     <w:top w:val="nil"/>
                     <w:bottom w:val="single" w:color="auto" w:sz="4" w:space="0"/>
@@ -492,13 +506,8 @@
                   <w:pPr>
                     <w:jc w:val="center"/>
                   </w:pPr>
-                  <w:proofErr w:type="gramStart"/>
-                  <w:r>
-                    <w:t>Date :</w:t>
-                  </w:r>
-                  <w:proofErr w:type="gramEnd"/>
-                  <w:r>
-                    <w:t xml:space="preserve"> </w:t>
+                  <w:r>
+                    <w:t xml:space="preserve">Date : </w:t>
                   </w:r>
                   <w:r>
                     <w:t xml:space="preserve"> </w:t>
@@ -515,11 +524,9 @@
                       <w:text/>
                     </w:sdtPr>
                     <w:sdtContent>
-                      <w:proofErr w:type="spellStart"/>
                       <w:r>
                         <w:t>CurrentDate</w:t>
                       </w:r>
-                      <w:proofErr w:type="spellEnd"/>
                     </w:sdtContent>
                   </w:sdt>
                 </w:p>
@@ -529,7 +536,7 @@
               <w:tc>
                 <w:tcPr>
                   <w:tcW w:w="11194" w:type="dxa"/>
-                  <w:gridSpan w:val="10"/>
+                  <w:gridSpan w:val="8"/>
                   <w:tcBorders>
                     <w:left w:val="nil"/>
                     <w:right w:val="nil"/>
@@ -566,7 +573,7 @@
               <w:tc>
                 <w:tcPr>
                   <w:tcW w:w="5812" w:type="dxa"/>
-                  <w:gridSpan w:val="6"/>
+                  <w:gridSpan w:val="4"/>
                   <w:shd w:val="clear" w:color="auto" w:fill="00B0F0"/>
                 </w:tcPr>
                 <w:p>
@@ -631,7 +638,7 @@
               <w:tc>
                 <w:tcPr>
                   <w:tcW w:w="5812" w:type="dxa"/>
-                  <w:gridSpan w:val="6"/>
+                  <w:gridSpan w:val="4"/>
                   <w:tcBorders>
                     <w:bottom w:val="nil"/>
                   </w:tcBorders>
@@ -655,11 +662,9 @@
                       <w:text/>
                     </w:sdtPr>
                     <w:sdtContent>
-                      <w:proofErr w:type="spellStart"/>
                       <w:r>
                         <w:t>Contract_ID</w:t>
                       </w:r>
-                      <w:proofErr w:type="spellEnd"/>
                     </w:sdtContent>
                   </w:sdt>
                 </w:p>
@@ -701,7 +706,7 @@
               <w:tc>
                 <w:tcPr>
                   <w:tcW w:w="5812" w:type="dxa"/>
-                  <w:gridSpan w:val="6"/>
+                  <w:gridSpan w:val="4"/>
                   <w:tcBorders>
                     <w:top w:val="nil"/>
                     <w:bottom w:val="nil"/>
@@ -723,11 +728,9 @@
                       <w:text/>
                     </w:sdtPr>
                     <w:sdtContent>
-                      <w:proofErr w:type="spellStart"/>
                       <w:r>
                         <w:t>Property_Name</w:t>
                       </w:r>
-                      <w:proofErr w:type="spellEnd"/>
                     </w:sdtContent>
                   </w:sdt>
                 </w:p>
@@ -762,13 +765,8 @@
                       <w:text/>
                     </w:sdtPr>
                     <w:sdtContent>
-                      <w:proofErr w:type="spellStart"/>
                       <w:r>
-                        <w:t>Phone_No</w:t>
-                      </w:r>
-                      <w:proofErr w:type="spellEnd"/>
-                      <w:r>
-                        <w:t>_</w:t>
+                        <w:t>Phone_No_</w:t>
                       </w:r>
                     </w:sdtContent>
                   </w:sdt>
@@ -777,7 +775,7 @@
               <w:tc>
                 <w:tcPr>
                   <w:tcW w:w="5812" w:type="dxa"/>
-                  <w:gridSpan w:val="6"/>
+                  <w:gridSpan w:val="4"/>
                   <w:tcBorders>
                     <w:top w:val="nil"/>
                     <w:bottom w:val="nil"/>
@@ -799,11 +797,9 @@
                       <w:text/>
                     </w:sdtPr>
                     <w:sdtContent>
-                      <w:proofErr w:type="spellStart"/>
                       <w:r>
                         <w:t>Unit_Name</w:t>
                       </w:r>
-                      <w:proofErr w:type="spellEnd"/>
                     </w:sdtContent>
                   </w:sdt>
                 </w:p>
@@ -838,11 +834,9 @@
                       <w:text/>
                     </w:sdtPr>
                     <w:sdtContent>
-                      <w:proofErr w:type="spellStart"/>
                       <w:r>
                         <w:t>E_Mail</w:t>
                       </w:r>
-                      <w:proofErr w:type="spellEnd"/>
                     </w:sdtContent>
                   </w:sdt>
                 </w:p>
@@ -850,7 +844,7 @@
               <w:tc>
                 <w:tcPr>
                   <w:tcW w:w="5812" w:type="dxa"/>
-                  <w:gridSpan w:val="6"/>
+                  <w:gridSpan w:val="4"/>
                   <w:tcBorders>
                     <w:top w:val="nil"/>
                     <w:bottom w:val="nil"/>
@@ -872,11 +866,9 @@
                       <w:text/>
                     </w:sdtPr>
                     <w:sdtContent>
-                      <w:proofErr w:type="spellStart"/>
                       <w:r>
                         <w:t>Contract_Start_Date</w:t>
                       </w:r>
-                      <w:proofErr w:type="spellEnd"/>
                     </w:sdtContent>
                   </w:sdt>
                   <w:r>
@@ -894,11 +886,9 @@
                       <w:text/>
                     </w:sdtPr>
                     <w:sdtContent>
-                      <w:proofErr w:type="spellStart"/>
                       <w:r>
                         <w:t>Contract_End_Date</w:t>
                       </w:r>
-                      <w:proofErr w:type="spellEnd"/>
                     </w:sdtContent>
                   </w:sdt>
                 </w:p>
@@ -920,12 +910,29 @@
                   <w:r>
                     <w:t xml:space="preserve">TRN: </w:t>
                   </w:r>
+                  <w:sdt>
+                    <w:sdtPr>
+                      <w:alias w:val="#Nav: /FinalCalculation/Customer/VAT_Registration_No_"/>
+                      <w:tag w:val="#Nav: Termination_Template/50113"/>
+                      <w:id w:val="393321613"/>
+                      <w:placeholder>
+                        <w:docPart w:val="DefaultPlaceholder_-1854013440"/>
+                      </w:placeholder>
+                      <w:dataBinding w:prefixMappings="xmlns:ns0='urn:microsoft-dynamics-nav/reports/Termination_Template/50113/'" w:xpath="/ns0:NavWordReportXmlPart[1]/ns0:FinalCalculation[1]/ns0:Customer[1]/ns0:VAT_Registration_No_[1]" w:storeItemID="{5BBF7251-B33A-47F9-BAE4-7493B14D6FF8}"/>
+                      <w:text/>
+                    </w:sdtPr>
+                    <w:sdtContent>
+                      <w:r>
+                        <w:t>VAT_Registration_No_</w:t>
+                      </w:r>
+                    </w:sdtContent>
+                  </w:sdt>
                 </w:p>
               </w:tc>
               <w:tc>
                 <w:tcPr>
                   <w:tcW w:w="5812" w:type="dxa"/>
-                  <w:gridSpan w:val="6"/>
+                  <w:gridSpan w:val="4"/>
                   <w:tcBorders>
                     <w:top w:val="nil"/>
                   </w:tcBorders>
@@ -946,11 +953,9 @@
                       <w:text/>
                     </w:sdtPr>
                     <w:sdtContent>
-                      <w:proofErr w:type="spellStart"/>
                       <w:r>
                         <w:t>Contract_Tenor</w:t>
                       </w:r>
-                      <w:proofErr w:type="spellEnd"/>
                     </w:sdtContent>
                   </w:sdt>
                 </w:p>
@@ -963,7 +968,7 @@
               <w:tc>
                 <w:tcPr>
                   <w:tcW w:w="11194" w:type="dxa"/>
-                  <w:gridSpan w:val="10"/>
+                  <w:gridSpan w:val="8"/>
                 </w:tcPr>
                 <w:p/>
               </w:tc>
@@ -982,13 +987,8 @@
                 </w:tcPr>
                 <w:p>
                   <w:r>
-                    <w:t xml:space="preserve">Contract Start Date        </w:t>
-                  </w:r>
-                  <w:proofErr w:type="gramStart"/>
-                  <w:r>
-                    <w:t xml:space="preserve">  :</w:t>
-                  </w:r>
-                  <w:proofErr w:type="gramEnd"/>
+                    <w:t>Contract Start Date          :</w:t>
+                  </w:r>
                   <w:r>
                     <w:t xml:space="preserve"> </w:t>
                   </w:r>
@@ -1004,11 +1004,9 @@
                       <w:text/>
                     </w:sdtPr>
                     <w:sdtContent>
-                      <w:proofErr w:type="spellStart"/>
                       <w:r>
                         <w:t>Contract_Start_Date</w:t>
                       </w:r>
-                      <w:proofErr w:type="spellEnd"/>
                     </w:sdtContent>
                   </w:sdt>
                 </w:p>
@@ -1016,20 +1014,15 @@
               <w:tc>
                 <w:tcPr>
                   <w:tcW w:w="5812" w:type="dxa"/>
-                  <w:gridSpan w:val="6"/>
+                  <w:gridSpan w:val="4"/>
                   <w:tcBorders>
                     <w:bottom w:val="nil"/>
                   </w:tcBorders>
                 </w:tcPr>
                 <w:p>
                   <w:r>
-                    <w:t xml:space="preserve">Intimation Date            </w:t>
-                  </w:r>
-                  <w:proofErr w:type="gramStart"/>
-                  <w:r>
-                    <w:t xml:space="preserve">  :</w:t>
-                  </w:r>
-                  <w:proofErr w:type="gramEnd"/>
+                    <w:t>Intimation Date              :</w:t>
+                  </w:r>
                   <w:r>
                     <w:t xml:space="preserve"> </w:t>
                   </w:r>
@@ -1045,11 +1038,9 @@
                       <w:text/>
                     </w:sdtPr>
                     <w:sdtContent>
-                      <w:proofErr w:type="spellStart"/>
                       <w:r>
                         <w:t>Intimation_Date</w:t>
                       </w:r>
-                      <w:proofErr w:type="spellEnd"/>
                     </w:sdtContent>
                   </w:sdt>
                 </w:p>
@@ -1070,13 +1061,8 @@
                 </w:tcPr>
                 <w:p>
                   <w:r>
-                    <w:t xml:space="preserve">Contract End Date          </w:t>
-                  </w:r>
-                  <w:proofErr w:type="gramStart"/>
-                  <w:r>
-                    <w:t xml:space="preserve">  :</w:t>
-                  </w:r>
-                  <w:proofErr w:type="gramEnd"/>
+                    <w:t>Contract End Date            :</w:t>
+                  </w:r>
                   <w:r>
                     <w:t xml:space="preserve"> </w:t>
                   </w:r>
@@ -1092,11 +1078,9 @@
                       <w:text/>
                     </w:sdtPr>
                     <w:sdtContent>
-                      <w:proofErr w:type="spellStart"/>
                       <w:r>
                         <w:t>Contract_End_Date</w:t>
                       </w:r>
-                      <w:proofErr w:type="spellEnd"/>
                     </w:sdtContent>
                   </w:sdt>
                 </w:p>
@@ -1104,7 +1088,7 @@
               <w:tc>
                 <w:tcPr>
                   <w:tcW w:w="5812" w:type="dxa"/>
-                  <w:gridSpan w:val="6"/>
+                  <w:gridSpan w:val="4"/>
                   <w:tcBorders>
                     <w:top w:val="nil"/>
                     <w:bottom w:val="nil"/>
@@ -1112,13 +1096,8 @@
                 </w:tcPr>
                 <w:p>
                   <w:r>
-                    <w:t xml:space="preserve">Termination Date         </w:t>
-                  </w:r>
-                  <w:proofErr w:type="gramStart"/>
-                  <w:r>
-                    <w:t xml:space="preserve">  :</w:t>
-                  </w:r>
-                  <w:proofErr w:type="gramEnd"/>
+                    <w:t>Termination Date           :</w:t>
+                  </w:r>
                   <w:r>
                     <w:t xml:space="preserve"> </w:t>
                   </w:r>
@@ -1134,11 +1113,9 @@
                       <w:text/>
                     </w:sdtPr>
                     <w:sdtContent>
-                      <w:proofErr w:type="spellStart"/>
                       <w:r>
                         <w:t>Termination_Date</w:t>
                       </w:r>
-                      <w:proofErr w:type="spellEnd"/>
                     </w:sdtContent>
                   </w:sdt>
                 </w:p>
@@ -1158,13 +1135,8 @@
                 </w:tcPr>
                 <w:p>
                   <w:r>
-                    <w:t xml:space="preserve">Original Contract </w:t>
-                  </w:r>
-                  <w:proofErr w:type="gramStart"/>
-                  <w:r>
-                    <w:t>Tenure :</w:t>
-                  </w:r>
-                  <w:proofErr w:type="gramEnd"/>
+                    <w:t>Original Contract Tenure :</w:t>
+                  </w:r>
                   <w:r>
                     <w:t xml:space="preserve"> </w:t>
                   </w:r>
@@ -1180,11 +1152,9 @@
                       <w:text/>
                     </w:sdtPr>
                     <w:sdtContent>
-                      <w:proofErr w:type="spellStart"/>
                       <w:r>
                         <w:t>Original_Contract_Tenure</w:t>
                       </w:r>
-                      <w:proofErr w:type="spellEnd"/>
                     </w:sdtContent>
                   </w:sdt>
                   <w:r>
@@ -1195,20 +1165,15 @@
               <w:tc>
                 <w:tcPr>
                   <w:tcW w:w="5812" w:type="dxa"/>
-                  <w:gridSpan w:val="6"/>
+                  <w:gridSpan w:val="4"/>
                   <w:tcBorders>
                     <w:top w:val="nil"/>
                   </w:tcBorders>
                 </w:tcPr>
                 <w:p>
                   <w:r>
-                    <w:t xml:space="preserve">Actual Contract </w:t>
-                  </w:r>
-                  <w:proofErr w:type="gramStart"/>
-                  <w:r>
-                    <w:t>Tenure :</w:t>
-                  </w:r>
-                  <w:proofErr w:type="gramEnd"/>
+                    <w:t>Actual Contract Tenure :</w:t>
+                  </w:r>
                   <w:r>
                     <w:t xml:space="preserve"> </w:t>
                   </w:r>
@@ -1224,11 +1189,9 @@
                       <w:text/>
                     </w:sdtPr>
                     <w:sdtContent>
-                      <w:proofErr w:type="spellStart"/>
                       <w:r>
                         <w:t>Actual_Contract_Tenure</w:t>
                       </w:r>
-                      <w:proofErr w:type="spellEnd"/>
                     </w:sdtContent>
                   </w:sdt>
                   <w:r>
@@ -1323,7 +1286,6 @@
               <w:tc>
                 <w:tcPr>
                   <w:tcW w:w="2210" w:type="dxa"/>
-                  <w:gridSpan w:val="2"/>
                   <w:shd w:val="clear" w:color="auto" w:fill="00B0F0"/>
                 </w:tcPr>
                 <w:p>
@@ -1377,7 +1339,6 @@
               <w:tc>
                 <w:tcPr>
                   <w:tcW w:w="1701" w:type="dxa"/>
-                  <w:gridSpan w:val="2"/>
                   <w:shd w:val="clear" w:color="auto" w:fill="00B0F0"/>
                 </w:tcPr>
                 <w:p>
@@ -1477,11 +1438,9 @@
                               <w:pPr>
                                 <w:jc w:val="center"/>
                               </w:pPr>
-                              <w:proofErr w:type="spellStart"/>
                               <w:r>
                                 <w:t>Period_Start_Date</w:t>
                               </w:r>
-                              <w:proofErr w:type="spellEnd"/>
                             </w:p>
                           </w:tc>
                         </w:sdtContent>
@@ -1508,11 +1467,9 @@
                               <w:pPr>
                                 <w:jc w:val="center"/>
                               </w:pPr>
-                              <w:proofErr w:type="spellStart"/>
                               <w:r>
                                 <w:t>Period_End_Date</w:t>
                               </w:r>
-                              <w:proofErr w:type="spellEnd"/>
                             </w:p>
                           </w:tc>
                         </w:sdtContent>
@@ -1532,18 +1489,15 @@
                           <w:tc>
                             <w:tcPr>
                               <w:tcW w:w="2210" w:type="dxa"/>
-                              <w:gridSpan w:val="2"/>
                               <w:shd w:val="clear" w:color="auto" w:fill="auto"/>
                             </w:tcPr>
                             <w:p>
                               <w:pPr>
                                 <w:jc w:val="center"/>
                               </w:pPr>
-                              <w:proofErr w:type="spellStart"/>
                               <w:r>
                                 <w:t>Final_Annual_Amount</w:t>
                               </w:r>
-                              <w:proofErr w:type="spellEnd"/>
                             </w:p>
                           </w:tc>
                         </w:sdtContent>
@@ -1570,11 +1524,9 @@
                               <w:pPr>
                                 <w:jc w:val="center"/>
                               </w:pPr>
-                              <w:proofErr w:type="spellStart"/>
                               <w:r>
                                 <w:t>Per_Day_Rent</w:t>
                               </w:r>
-                              <w:proofErr w:type="spellEnd"/>
                             </w:p>
                           </w:tc>
                         </w:sdtContent>
@@ -1594,18 +1546,15 @@
                           <w:tc>
                             <w:tcPr>
                               <w:tcW w:w="1701" w:type="dxa"/>
-                              <w:gridSpan w:val="2"/>
                               <w:shd w:val="clear" w:color="auto" w:fill="auto"/>
                             </w:tcPr>
                             <w:p>
                               <w:pPr>
                                 <w:jc w:val="center"/>
                               </w:pPr>
-                              <w:proofErr w:type="spellStart"/>
                               <w:r>
                                 <w:t>Total_F_A_A</w:t>
                               </w:r>
-                              <w:proofErr w:type="spellEnd"/>
                             </w:p>
                           </w:tc>
                         </w:sdtContent>
@@ -1622,7 +1571,7 @@
               <w:tc>
                 <w:tcPr>
                   <w:tcW w:w="11194" w:type="dxa"/>
-                  <w:gridSpan w:val="10"/>
+                  <w:gridSpan w:val="8"/>
                   <w:tcBorders>
                     <w:bottom w:val="single" w:color="auto" w:sz="4" w:space="0"/>
                   </w:tcBorders>
@@ -1659,7 +1608,7 @@
               </w:trPr>
               <w:tc>
                 <w:tcPr>
-                  <w:tcW w:w="4106" w:type="dxa"/>
+                  <w:tcW w:w="3539" w:type="dxa"/>
                   <w:gridSpan w:val="3"/>
                   <w:tcBorders>
                     <w:bottom w:val="single" w:color="auto" w:sz="4" w:space="0"/>
@@ -1688,8 +1637,7 @@
               </w:tc>
               <w:tc>
                 <w:tcPr>
-                  <w:tcW w:w="1665" w:type="dxa"/>
-                  <w:gridSpan w:val="2"/>
+                  <w:tcW w:w="1843" w:type="dxa"/>
                   <w:tcBorders>
                     <w:bottom w:val="single" w:color="auto" w:sz="4" w:space="0"/>
                   </w:tcBorders>
@@ -1718,8 +1666,8 @@
               </w:tc>
               <w:tc>
                 <w:tcPr>
-                  <w:tcW w:w="3948" w:type="dxa"/>
-                  <w:gridSpan w:val="4"/>
+                  <w:tcW w:w="4111" w:type="dxa"/>
+                  <w:gridSpan w:val="3"/>
                   <w:tcBorders>
                     <w:bottom w:val="single" w:color="auto" w:sz="4" w:space="0"/>
                   </w:tcBorders>
@@ -1747,7 +1695,7 @@
               </w:tc>
               <w:tc>
                 <w:tcPr>
-                  <w:tcW w:w="1475" w:type="dxa"/>
+                  <w:tcW w:w="1701" w:type="dxa"/>
                   <w:tcBorders>
                     <w:bottom w:val="single" w:color="auto" w:sz="4" w:space="0"/>
                   </w:tcBorders>
@@ -1781,7 +1729,7 @@
               </w:trPr>
               <w:tc>
                 <w:tcPr>
-                  <w:tcW w:w="4106" w:type="dxa"/>
+                  <w:tcW w:w="3539" w:type="dxa"/>
                   <w:gridSpan w:val="3"/>
                   <w:tcBorders>
                     <w:bottom w:val="nil"/>
@@ -1817,8 +1765,7 @@
                 <w:sdtContent>
                   <w:tc>
                     <w:tcPr>
-                      <w:tcW w:w="1665" w:type="dxa"/>
-                      <w:gridSpan w:val="2"/>
+                      <w:tcW w:w="1843" w:type="dxa"/>
                       <w:tcBorders>
                         <w:bottom w:val="nil"/>
                       </w:tcBorders>
@@ -1827,19 +1774,17 @@
                       <w:pPr>
                         <w:jc w:val="right"/>
                       </w:pPr>
-                      <w:proofErr w:type="spellStart"/>
                       <w:r>
                         <w:t>Rev_AIV</w:t>
                       </w:r>
-                      <w:proofErr w:type="spellEnd"/>
                     </w:p>
                   </w:tc>
                 </w:sdtContent>
               </w:sdt>
               <w:tc>
                 <w:tcPr>
-                  <w:tcW w:w="3948" w:type="dxa"/>
-                  <w:gridSpan w:val="4"/>
+                  <w:tcW w:w="4111" w:type="dxa"/>
+                  <w:gridSpan w:val="3"/>
                   <w:tcBorders>
                     <w:bottom w:val="nil"/>
                   </w:tcBorders>
@@ -1874,7 +1819,7 @@
                 <w:sdtContent>
                   <w:tc>
                     <w:tcPr>
-                      <w:tcW w:w="1475" w:type="dxa"/>
+                      <w:tcW w:w="1701" w:type="dxa"/>
                       <w:tcBorders>
                         <w:bottom w:val="nil"/>
                       </w:tcBorders>
@@ -1897,7 +1842,7 @@
               </w:trPr>
               <w:tc>
                 <w:tcPr>
-                  <w:tcW w:w="4106" w:type="dxa"/>
+                  <w:tcW w:w="3539" w:type="dxa"/>
                   <w:gridSpan w:val="3"/>
                   <w:tcBorders>
                     <w:top w:val="nil"/>
@@ -1934,8 +1879,7 @@
                 <w:sdtContent>
                   <w:tc>
                     <w:tcPr>
-                      <w:tcW w:w="1665" w:type="dxa"/>
-                      <w:gridSpan w:val="2"/>
+                      <w:tcW w:w="1843" w:type="dxa"/>
                       <w:tcBorders>
                         <w:top w:val="nil"/>
                         <w:bottom w:val="nil"/>
@@ -1945,19 +1889,17 @@
                       <w:pPr>
                         <w:jc w:val="right"/>
                       </w:pPr>
-                      <w:proofErr w:type="spellStart"/>
                       <w:r>
                         <w:t>Rec_AIV</w:t>
                       </w:r>
-                      <w:proofErr w:type="spellEnd"/>
                     </w:p>
                   </w:tc>
                 </w:sdtContent>
               </w:sdt>
               <w:tc>
                 <w:tcPr>
-                  <w:tcW w:w="3948" w:type="dxa"/>
-                  <w:gridSpan w:val="4"/>
+                  <w:tcW w:w="4111" w:type="dxa"/>
+                  <w:gridSpan w:val="3"/>
                   <w:tcBorders>
                     <w:top w:val="nil"/>
                     <w:bottom w:val="nil"/>
@@ -1993,7 +1935,7 @@
                 <w:sdtContent>
                   <w:tc>
                     <w:tcPr>
-                      <w:tcW w:w="1475" w:type="dxa"/>
+                      <w:tcW w:w="1701" w:type="dxa"/>
                       <w:tcBorders>
                         <w:top w:val="nil"/>
                         <w:bottom w:val="nil"/>
@@ -2017,7 +1959,7 @@
               </w:trPr>
               <w:tc>
                 <w:tcPr>
-                  <w:tcW w:w="4106" w:type="dxa"/>
+                  <w:tcW w:w="3539" w:type="dxa"/>
                   <w:gridSpan w:val="3"/>
                   <w:tcBorders>
                     <w:top w:val="nil"/>
@@ -2079,8 +2021,7 @@
                 <w:sdtContent>
                   <w:tc>
                     <w:tcPr>
-                      <w:tcW w:w="1665" w:type="dxa"/>
-                      <w:gridSpan w:val="2"/>
+                      <w:tcW w:w="1843" w:type="dxa"/>
                       <w:tcBorders>
                         <w:top w:val="nil"/>
                       </w:tcBorders>
@@ -2093,7 +2034,6 @@
                           <w:bCs/>
                         </w:rPr>
                       </w:pPr>
-                      <w:proofErr w:type="spellStart"/>
                       <w:r>
                         <w:rPr>
                           <w:b/>
@@ -2101,15 +2041,14 @@
                         </w:rPr>
                         <w:t>Rent_BP</w:t>
                       </w:r>
-                      <w:proofErr w:type="spellEnd"/>
                     </w:p>
                   </w:tc>
                 </w:sdtContent>
               </w:sdt>
               <w:tc>
                 <w:tcPr>
-                  <w:tcW w:w="3948" w:type="dxa"/>
-                  <w:gridSpan w:val="4"/>
+                  <w:tcW w:w="4111" w:type="dxa"/>
+                  <w:gridSpan w:val="3"/>
                   <w:tcBorders>
                     <w:top w:val="nil"/>
                   </w:tcBorders>
@@ -2170,7 +2109,7 @@
                 <w:sdtContent>
                   <w:tc>
                     <w:tcPr>
-                      <w:tcW w:w="1475" w:type="dxa"/>
+                      <w:tcW w:w="1701" w:type="dxa"/>
                       <w:tcBorders>
                         <w:top w:val="nil"/>
                       </w:tcBorders>
@@ -2202,7 +2141,7 @@
               <w:tc>
                 <w:tcPr>
                   <w:tcW w:w="11194" w:type="dxa"/>
-                  <w:gridSpan w:val="10"/>
+                  <w:gridSpan w:val="8"/>
                 </w:tcPr>
                 <w:p>
                   <w:pPr>
@@ -2221,8 +2160,8 @@
               </w:trPr>
               <w:tc>
                 <w:tcPr>
-                  <w:tcW w:w="4106" w:type="dxa"/>
-                  <w:gridSpan w:val="3"/>
+                  <w:tcW w:w="9493" w:type="dxa"/>
+                  <w:gridSpan w:val="7"/>
                   <w:tcBorders>
                     <w:bottom w:val="single" w:color="auto" w:sz="4" w:space="0"/>
                   </w:tcBorders>
@@ -2244,34 +2183,13 @@
                       <w:sz w:val="24"/>
                       <w:szCs w:val="24"/>
                     </w:rPr>
-                    <w:t xml:space="preserve">Additional </w:t>
-                  </w:r>
-                  <w:proofErr w:type="gramStart"/>
-                  <w:r>
-                    <w:rPr>
-                      <w:b/>
-                      <w:bCs/>
-                      <w:sz w:val="24"/>
-                      <w:szCs w:val="24"/>
-                    </w:rPr>
-                    <w:t>Charges(</w:t>
-                  </w:r>
-                  <w:proofErr w:type="gramEnd"/>
-                  <w:r>
-                    <w:rPr>
-                      <w:b/>
-                      <w:bCs/>
-                      <w:sz w:val="24"/>
-                      <w:szCs w:val="24"/>
-                    </w:rPr>
-                    <w:t>Inclusive of Tax)</w:t>
-                  </w:r>
-                </w:p>
-              </w:tc>
-              <w:tc>
-                <w:tcPr>
-                  <w:tcW w:w="1665" w:type="dxa"/>
-                  <w:gridSpan w:val="2"/>
+                    <w:t>Additional Charges(Inclusive of Tax)</w:t>
+                  </w:r>
+                </w:p>
+              </w:tc>
+              <w:tc>
+                <w:tcPr>
+                  <w:tcW w:w="1701" w:type="dxa"/>
                   <w:tcBorders>
                     <w:bottom w:val="single" w:color="auto" w:sz="4" w:space="0"/>
                   </w:tcBorders>
@@ -2298,141 +2216,288 @@
                   </w:r>
                 </w:p>
               </w:tc>
-              <w:tc>
-                <w:tcPr>
-                  <w:tcW w:w="3948" w:type="dxa"/>
-                  <w:gridSpan w:val="4"/>
-                  <w:tcBorders>
-                    <w:bottom w:val="single" w:color="auto" w:sz="4" w:space="0"/>
-                  </w:tcBorders>
-                  <w:shd w:val="clear" w:color="auto" w:fill="00B0F0"/>
-                </w:tcPr>
-                <w:p>
-                  <w:pPr>
-                    <w:rPr>
-                      <w:b/>
-                      <w:bCs/>
-                      <w:sz w:val="24"/>
-                      <w:szCs w:val="24"/>
-                    </w:rPr>
-                  </w:pPr>
-                  <w:r>
-                    <w:rPr>
-                      <w:b/>
-                      <w:bCs/>
-                      <w:sz w:val="24"/>
-                      <w:szCs w:val="24"/>
-                    </w:rPr>
-                    <w:t>Refundable Deposits</w:t>
-                  </w:r>
-                </w:p>
-              </w:tc>
-              <w:tc>
-                <w:tcPr>
-                  <w:tcW w:w="1475" w:type="dxa"/>
-                  <w:tcBorders>
-                    <w:bottom w:val="single" w:color="auto" w:sz="4" w:space="0"/>
-                  </w:tcBorders>
-                  <w:shd w:val="clear" w:color="auto" w:fill="00B0F0"/>
-                </w:tcPr>
-                <w:p>
-                  <w:pPr>
-                    <w:jc w:val="center"/>
-                    <w:rPr>
-                      <w:b/>
-                      <w:bCs/>
-                      <w:sz w:val="24"/>
-                      <w:szCs w:val="24"/>
-                    </w:rPr>
-                  </w:pPr>
-                  <w:r>
-                    <w:rPr>
-                      <w:b/>
-                      <w:bCs/>
-                      <w:sz w:val="24"/>
-                      <w:szCs w:val="24"/>
-                    </w:rPr>
-                    <w:t>Amount</w:t>
-                  </w:r>
-                </w:p>
-              </w:tc>
             </w:tr>
+            <w:sdt>
+              <w:sdtPr>
+                <w:rPr>
+                  <w:sz w:val="24"/>
+                  <w:szCs w:val="24"/>
+                </w:rPr>
+                <w:alias w:val="#Nav: /FinalCalculation/Additional_Charges_Sub"/>
+                <w:tag w:val="#Nav: Termination_Template/50113"/>
+                <w:id w:val="-401372242"/>
+                <w15:dataBinding w:prefixMappings="xmlns:ns0='urn:microsoft-dynamics-nav/reports/Termination_Template/50113/'" w:xpath="/ns0:NavWordReportXmlPart[1]/ns0:FinalCalculation[1]/ns0:Additional_Charges_Sub" w:storeItemID="{5BBF7251-B33A-47F9-BAE4-7493B14D6FF8}"/>
+                <w15:repeatingSection/>
+              </w:sdtPr>
+              <w:sdtContent>
+                <w:sdt>
+                  <w:sdtPr>
+                    <w:rPr>
+                      <w:sz w:val="24"/>
+                      <w:szCs w:val="24"/>
+                    </w:rPr>
+                    <w:id w:val="-156003702"/>
+                    <w:placeholder>
+                      <w:docPart w:val="DefaultPlaceholder_-1854013435"/>
+                    </w:placeholder>
+                    <w15:repeatingSectionItem/>
+                  </w:sdtPr>
+                  <w:sdtContent>
+                    <w:tr>
+                      <w:trPr>
+                        <w:trHeight w:val="276"/>
+                      </w:trPr>
+                      <w:sdt>
+                        <w:sdtPr>
+                          <w:rPr>
+                            <w:sz w:val="24"/>
+                            <w:szCs w:val="24"/>
+                          </w:rPr>
+                          <w:alias w:val="#Nav: /FinalCalculation/Additional_Charges_Sub/Secondary_Item_Type"/>
+                          <w:tag w:val="#Nav: Termination_Template/50113"/>
+                          <w:id w:val="-1283035005"/>
+                          <w:placeholder>
+                            <w:docPart w:val="DefaultPlaceholder_-1854013440"/>
+                          </w:placeholder>
+                          <w:dataBinding w:prefixMappings="xmlns:ns0='urn:microsoft-dynamics-nav/reports/Termination_Template/50113/'" w:xpath="/ns0:NavWordReportXmlPart[1]/ns0:FinalCalculation[1]/ns0:Additional_Charges_Sub[1]/ns0:Secondary_Item_Type[1]" w:storeItemID="{5BBF7251-B33A-47F9-BAE4-7493B14D6FF8}"/>
+                          <w:text/>
+                        </w:sdtPr>
+                        <w:sdtContent>
+                          <w:tc>
+                            <w:tcPr>
+                              <w:tcW w:w="9493" w:type="dxa"/>
+                              <w:gridSpan w:val="7"/>
+                              <w:tcBorders>
+                                <w:top w:val="nil"/>
+                                <w:bottom w:val="nil"/>
+                              </w:tcBorders>
+                            </w:tcPr>
+                            <w:p>
+                              <w:pPr>
+                                <w:rPr>
+                                  <w:sz w:val="24"/>
+                                  <w:szCs w:val="24"/>
+                                </w:rPr>
+                              </w:pPr>
+                              <w:r>
+                                <w:rPr>
+                                  <w:sz w:val="24"/>
+                                  <w:szCs w:val="24"/>
+                                </w:rPr>
+                                <w:t>Secondary_Item_Type</w:t>
+                              </w:r>
+                            </w:p>
+                          </w:tc>
+                        </w:sdtContent>
+                      </w:sdt>
+                      <w:sdt>
+                        <w:sdtPr>
+                          <w:rPr>
+                            <w:sz w:val="24"/>
+                            <w:szCs w:val="24"/>
+                          </w:rPr>
+                          <w:alias w:val="#Nav: /FinalCalculation/Additional_Charges_Sub/Amount_IV"/>
+                          <w:tag w:val="#Nav: Termination_Template/50113"/>
+                          <w:id w:val="-470442751"/>
+                          <w:placeholder>
+                            <w:docPart w:val="DefaultPlaceholder_-1854013440"/>
+                          </w:placeholder>
+                          <w:dataBinding w:prefixMappings="xmlns:ns0='urn:microsoft-dynamics-nav/reports/Termination_Template/50113/'" w:xpath="/ns0:NavWordReportXmlPart[1]/ns0:FinalCalculation[1]/ns0:Additional_Charges_Sub[1]/ns0:Amount_IV[1]" w:storeItemID="{5BBF7251-B33A-47F9-BAE4-7493B14D6FF8}"/>
+                          <w:text/>
+                        </w:sdtPr>
+                        <w:sdtContent>
+                          <w:tc>
+                            <w:tcPr>
+                              <w:tcW w:w="1701" w:type="dxa"/>
+                              <w:tcBorders>
+                                <w:top w:val="nil"/>
+                                <w:bottom w:val="nil"/>
+                              </w:tcBorders>
+                            </w:tcPr>
+                            <w:p>
+                              <w:pPr>
+                                <w:jc w:val="right"/>
+                              </w:pPr>
+                              <w:r>
+                                <w:rPr>
+                                  <w:sz w:val="24"/>
+                                  <w:szCs w:val="24"/>
+                                </w:rPr>
+                                <w:t>Amount_IV</w:t>
+                              </w:r>
+                            </w:p>
+                          </w:tc>
+                        </w:sdtContent>
+                      </w:sdt>
+                    </w:tr>
+                  </w:sdtContent>
+                </w:sdt>
+              </w:sdtContent>
+            </w:sdt>
             <w:tr>
               <w:trPr>
                 <w:trHeight w:val="276"/>
               </w:trPr>
               <w:tc>
                 <w:tcPr>
-                  <w:tcW w:w="4106" w:type="dxa"/>
-                  <w:gridSpan w:val="3"/>
-                  <w:tcBorders>
-                    <w:bottom w:val="nil"/>
+                  <w:tcW w:w="9493" w:type="dxa"/>
+                  <w:gridSpan w:val="7"/>
+                  <w:tcBorders>
+                    <w:top w:val="nil"/>
+                    <w:bottom w:val="single" w:color="auto" w:sz="4" w:space="0"/>
                   </w:tcBorders>
                 </w:tcPr>
                 <w:p>
                   <w:pPr>
                     <w:rPr>
+                      <w:b/>
+                      <w:bCs/>
                       <w:sz w:val="24"/>
                       <w:szCs w:val="24"/>
                     </w:rPr>
                   </w:pPr>
                   <w:r>
                     <w:rPr>
-                      <w:sz w:val="24"/>
-                      <w:szCs w:val="24"/>
-                    </w:rPr>
-                    <w:t>Early Termination Fee</w:t>
+                      <w:b/>
+                      <w:bCs/>
+                      <w:sz w:val="24"/>
+                      <w:szCs w:val="24"/>
+                    </w:rPr>
+                    <w:t>Total</w:t>
                   </w:r>
                 </w:p>
               </w:tc>
               <w:sdt>
                 <w:sdtPr>
-                  <w:alias w:val="#Nav: /FinalCalculation/Additional_Charges_Sub/Early_T_F"/>
+                  <w:rPr>
+                    <w:b/>
+                    <w:bCs/>
+                  </w:rPr>
+                  <w:alias w:val="#Nav: /FinalCalculation/Total_AdC"/>
                   <w:tag w:val="#Nav: Termination_Template/50113"/>
-                  <w:id w:val="1979648807"/>
+                  <w:id w:val="-594166686"/>
                   <w:placeholder>
                     <w:docPart w:val="DefaultPlaceholder_-1854013440"/>
                   </w:placeholder>
-                  <w:dataBinding w:prefixMappings="xmlns:ns0='urn:microsoft-dynamics-nav/reports/Termination_Template/50113/'" w:xpath="/ns0:NavWordReportXmlPart[1]/ns0:FinalCalculation[1]/ns0:Additional_Charges_Sub[1]/ns0:Early_T_F[1]" w:storeItemID="{5BBF7251-B33A-47F9-BAE4-7493B14D6FF8}"/>
+                  <w:dataBinding w:prefixMappings="xmlns:ns0='urn:microsoft-dynamics-nav/reports/Termination_Template/50113/'" w:xpath="/ns0:NavWordReportXmlPart[1]/ns0:FinalCalculation[1]/ns0:Total_AdC[1]" w:storeItemID="{5BBF7251-B33A-47F9-BAE4-7493B14D6FF8}"/>
                   <w:text/>
                 </w:sdtPr>
                 <w:sdtContent>
                   <w:tc>
                     <w:tcPr>
-                      <w:tcW w:w="1665" w:type="dxa"/>
-                      <w:gridSpan w:val="2"/>
+                      <w:tcW w:w="1701" w:type="dxa"/>
                       <w:tcBorders>
-                        <w:bottom w:val="nil"/>
+                        <w:top w:val="nil"/>
+                        <w:bottom w:val="single" w:color="auto" w:sz="4" w:space="0"/>
                       </w:tcBorders>
                     </w:tcPr>
                     <w:p>
                       <w:pPr>
                         <w:jc w:val="right"/>
                       </w:pPr>
-                      <w:proofErr w:type="spellStart"/>
                       <w:r>
-                        <w:t>Early_T_F</w:t>
+                        <w:rPr>
+                          <w:b/>
+                          <w:bCs/>
+                        </w:rPr>
+                        <w:t>Total_AdC</w:t>
                       </w:r>
-                      <w:proofErr w:type="spellEnd"/>
                     </w:p>
                   </w:tc>
                 </w:sdtContent>
               </w:sdt>
-              <w:tc>
-                <w:tcPr>
-                  <w:tcW w:w="3948" w:type="dxa"/>
-                  <w:gridSpan w:val="4"/>
-                  <w:tcBorders>
+            </w:tr>
+            <w:tr>
+              <w:trPr>
+                <w:trHeight w:val="276"/>
+              </w:trPr>
+              <w:tc>
+                <w:tcPr>
+                  <w:tcW w:w="11194" w:type="dxa"/>
+                  <w:gridSpan w:val="8"/>
+                  <w:tcBorders>
+                    <w:top w:val="single" w:color="auto" w:sz="4" w:space="0"/>
+                    <w:bottom w:val="single" w:color="auto" w:sz="4" w:space="0"/>
+                  </w:tcBorders>
+                </w:tcPr>
+                <w:p>
+                  <w:pPr>
+                    <w:jc w:val="right"/>
+                  </w:pPr>
+                </w:p>
+              </w:tc>
+            </w:tr>
+            <w:tr>
+              <w:trPr>
+                <w:trHeight w:val="276"/>
+              </w:trPr>
+              <w:tc>
+                <w:tcPr>
+                  <w:tcW w:w="9493" w:type="dxa"/>
+                  <w:gridSpan w:val="7"/>
+                  <w:tcBorders>
+                    <w:top w:val="single" w:color="auto" w:sz="4" w:space="0"/>
+                    <w:bottom w:val="single" w:color="auto" w:sz="4" w:space="0"/>
+                  </w:tcBorders>
+                  <w:shd w:val="clear" w:color="auto" w:fill="00B0F0"/>
+                </w:tcPr>
+                <w:p>
+                  <w:pPr>
+                    <w:rPr>
+                      <w:b/>
+                      <w:bCs/>
+                    </w:rPr>
+                  </w:pPr>
+                  <w:r>
+                    <w:rPr>
+                      <w:b/>
+                      <w:bCs/>
+                      <w:sz w:val="24"/>
+                      <w:szCs w:val="24"/>
+                    </w:rPr>
+                    <w:t>Refundable Deposits</w:t>
+                  </w:r>
+                </w:p>
+              </w:tc>
+              <w:tc>
+                <w:tcPr>
+                  <w:tcW w:w="1701" w:type="dxa"/>
+                  <w:tcBorders>
+                    <w:top w:val="single" w:color="auto" w:sz="4" w:space="0"/>
+                    <w:bottom w:val="single" w:color="auto" w:sz="4" w:space="0"/>
+                  </w:tcBorders>
+                  <w:shd w:val="clear" w:color="auto" w:fill="00B0F0"/>
+                </w:tcPr>
+                <w:p>
+                  <w:pPr>
+                    <w:jc w:val="right"/>
+                  </w:pPr>
+                  <w:r>
+                    <w:rPr>
+                      <w:b/>
+                      <w:bCs/>
+                      <w:sz w:val="24"/>
+                      <w:szCs w:val="24"/>
+                    </w:rPr>
+                    <w:t>Amount</w:t>
+                  </w:r>
+                </w:p>
+              </w:tc>
+            </w:tr>
+            <w:tr>
+              <w:trPr>
+                <w:trHeight w:val="276"/>
+              </w:trPr>
+              <w:tc>
+                <w:tcPr>
+                  <w:tcW w:w="9493" w:type="dxa"/>
+                  <w:gridSpan w:val="7"/>
+                  <w:tcBorders>
+                    <w:top w:val="single" w:color="auto" w:sz="4" w:space="0"/>
                     <w:bottom w:val="nil"/>
                   </w:tcBorders>
                 </w:tcPr>
                 <w:p>
-                  <w:pPr>
-                    <w:rPr>
-                      <w:sz w:val="24"/>
-                      <w:szCs w:val="24"/>
-                    </w:rPr>
-                  </w:pPr>
                   <w:r>
                     <w:rPr>
                       <w:sz w:val="24"/>
@@ -2446,7 +2511,7 @@
                 <w:sdtPr>
                   <w:alias w:val="#Nav: /FinalCalculation/Sec_De"/>
                   <w:tag w:val="#Nav: Termination_Template/50113"/>
-                  <w:id w:val="-15544825"/>
+                  <w:id w:val="725872491"/>
                   <w:placeholder>
                     <w:docPart w:val="DefaultPlaceholder_-1854013440"/>
                   </w:placeholder>
@@ -2456,8 +2521,9 @@
                 <w:sdtContent>
                   <w:tc>
                     <w:tcPr>
-                      <w:tcW w:w="1475" w:type="dxa"/>
+                      <w:tcW w:w="1701" w:type="dxa"/>
                       <w:tcBorders>
+                        <w:top w:val="single" w:color="auto" w:sz="4" w:space="0"/>
                         <w:bottom w:val="nil"/>
                       </w:tcBorders>
                     </w:tcPr>
@@ -2465,11 +2531,9 @@
                       <w:pPr>
                         <w:jc w:val="right"/>
                       </w:pPr>
-                      <w:proofErr w:type="spellStart"/>
                       <w:r>
                         <w:t>Sec_De</w:t>
                       </w:r>
-                      <w:proofErr w:type="spellEnd"/>
                     </w:p>
                   </w:tc>
                 </w:sdtContent>
@@ -2481,45 +2545,38 @@
               </w:trPr>
               <w:tc>
                 <w:tcPr>
-                  <w:tcW w:w="4106" w:type="dxa"/>
-                  <w:gridSpan w:val="3"/>
+                  <w:tcW w:w="9493" w:type="dxa"/>
+                  <w:gridSpan w:val="7"/>
                   <w:tcBorders>
                     <w:top w:val="nil"/>
                     <w:bottom w:val="nil"/>
                   </w:tcBorders>
                 </w:tcPr>
                 <w:p>
-                  <w:pPr>
-                    <w:rPr>
-                      <w:sz w:val="24"/>
-                      <w:szCs w:val="24"/>
-                    </w:rPr>
-                  </w:pPr>
-                  <w:r>
-                    <w:rPr>
-                      <w:sz w:val="24"/>
-                      <w:szCs w:val="24"/>
-                    </w:rPr>
-                    <w:t>Late Intimation Fee</w:t>
+                  <w:r>
+                    <w:rPr>
+                      <w:sz w:val="24"/>
+                      <w:szCs w:val="24"/>
+                    </w:rPr>
+                    <w:t>Adjustments</w:t>
                   </w:r>
                 </w:p>
               </w:tc>
               <w:sdt>
                 <w:sdtPr>
-                  <w:alias w:val="#Nav: /FinalCalculation/Additional_Charges_Sub/Late_I_F"/>
+                  <w:alias w:val="#Nav: /FinalCalculation/Ad_Sec_De"/>
                   <w:tag w:val="#Nav: Termination_Template/50113"/>
-                  <w:id w:val="492536880"/>
+                  <w:id w:val="-352268574"/>
                   <w:placeholder>
                     <w:docPart w:val="DefaultPlaceholder_-1854013440"/>
                   </w:placeholder>
-                  <w:dataBinding w:prefixMappings="xmlns:ns0='urn:microsoft-dynamics-nav/reports/Termination_Template/50113/'" w:xpath="/ns0:NavWordReportXmlPart[1]/ns0:FinalCalculation[1]/ns0:Additional_Charges_Sub[1]/ns0:Late_I_F[1]" w:storeItemID="{5BBF7251-B33A-47F9-BAE4-7493B14D6FF8}"/>
+                  <w:dataBinding w:prefixMappings="xmlns:ns0='urn:microsoft-dynamics-nav/reports/Termination_Template/50113/'" w:xpath="/ns0:NavWordReportXmlPart[1]/ns0:FinalCalculation[1]/ns0:Ad_Sec_De[1]" w:storeItemID="{5BBF7251-B33A-47F9-BAE4-7493B14D6FF8}"/>
                   <w:text/>
                 </w:sdtPr>
                 <w:sdtContent>
                   <w:tc>
                     <w:tcPr>
-                      <w:tcW w:w="1665" w:type="dxa"/>
-                      <w:gridSpan w:val="2"/>
+                      <w:tcW w:w="1701" w:type="dxa"/>
                       <w:tcBorders>
                         <w:top w:val="nil"/>
                         <w:bottom w:val="nil"/>
@@ -2529,55 +2586,52 @@
                       <w:pPr>
                         <w:jc w:val="right"/>
                       </w:pPr>
-                      <w:proofErr w:type="spellStart"/>
                       <w:r>
-                        <w:t>Late_I_F</w:t>
+                        <w:t>Ad_Sec_De</w:t>
                       </w:r>
-                      <w:proofErr w:type="spellEnd"/>
                     </w:p>
                   </w:tc>
                 </w:sdtContent>
               </w:sdt>
-              <w:tc>
-                <w:tcPr>
-                  <w:tcW w:w="3948" w:type="dxa"/>
-                  <w:gridSpan w:val="4"/>
+            </w:tr>
+            <w:tr>
+              <w:trPr>
+                <w:trHeight w:val="276"/>
+              </w:trPr>
+              <w:tc>
+                <w:tcPr>
+                  <w:tcW w:w="9493" w:type="dxa"/>
+                  <w:gridSpan w:val="7"/>
                   <w:tcBorders>
                     <w:top w:val="nil"/>
                     <w:bottom w:val="nil"/>
                   </w:tcBorders>
                 </w:tcPr>
                 <w:p>
-                  <w:pPr>
-                    <w:rPr>
-                      <w:sz w:val="24"/>
-                      <w:szCs w:val="24"/>
-                    </w:rPr>
-                  </w:pPr>
-                  <w:r>
-                    <w:rPr>
-                      <w:sz w:val="24"/>
-                      <w:szCs w:val="24"/>
-                    </w:rPr>
-                    <w:t>Adjustments</w:t>
+                  <w:r>
+                    <w:rPr>
+                      <w:sz w:val="24"/>
+                      <w:szCs w:val="24"/>
+                    </w:rPr>
+                    <w:t>Net Balance of Security Deposit</w:t>
                   </w:r>
                 </w:p>
               </w:tc>
               <w:sdt>
                 <w:sdtPr>
-                  <w:alias w:val="#Nav: /FinalCalculation/Ad_Sec_De"/>
+                  <w:alias w:val="#Nav: /FinalCalculation/Net_Ba"/>
                   <w:tag w:val="#Nav: Termination_Template/50113"/>
-                  <w:id w:val="1599221224"/>
+                  <w:id w:val="1979949500"/>
                   <w:placeholder>
                     <w:docPart w:val="DefaultPlaceholder_-1854013440"/>
                   </w:placeholder>
-                  <w:dataBinding w:prefixMappings="xmlns:ns0='urn:microsoft-dynamics-nav/reports/Termination_Template/50113/'" w:xpath="/ns0:NavWordReportXmlPart[1]/ns0:FinalCalculation[1]/ns0:Ad_Sec_De[1]" w:storeItemID="{5BBF7251-B33A-47F9-BAE4-7493B14D6FF8}"/>
+                  <w:dataBinding w:prefixMappings="xmlns:ns0='urn:microsoft-dynamics-nav/reports/Termination_Template/50113/'" w:xpath="/ns0:NavWordReportXmlPart[1]/ns0:FinalCalculation[1]/ns0:Net_Ba[1]" w:storeItemID="{5BBF7251-B33A-47F9-BAE4-7493B14D6FF8}"/>
                   <w:text/>
                 </w:sdtPr>
                 <w:sdtContent>
                   <w:tc>
                     <w:tcPr>
-                      <w:tcW w:w="1475" w:type="dxa"/>
+                      <w:tcW w:w="1701" w:type="dxa"/>
                       <w:tcBorders>
                         <w:top w:val="nil"/>
                         <w:bottom w:val="nil"/>
@@ -2587,11 +2641,9 @@
                       <w:pPr>
                         <w:jc w:val="right"/>
                       </w:pPr>
-                      <w:proofErr w:type="spellStart"/>
                       <w:r>
-                        <w:t>Ad_Sec_De</w:t>
+                        <w:t>Net_Ba</w:t>
                       </w:r>
-                      <w:proofErr w:type="spellEnd"/>
                     </w:p>
                   </w:tc>
                 </w:sdtContent>
@@ -2603,45 +2655,38 @@
               </w:trPr>
               <w:tc>
                 <w:tcPr>
-                  <w:tcW w:w="4106" w:type="dxa"/>
-                  <w:gridSpan w:val="3"/>
+                  <w:tcW w:w="9493" w:type="dxa"/>
+                  <w:gridSpan w:val="7"/>
                   <w:tcBorders>
                     <w:top w:val="nil"/>
                     <w:bottom w:val="nil"/>
                   </w:tcBorders>
                 </w:tcPr>
                 <w:p>
-                  <w:pPr>
-                    <w:rPr>
-                      <w:sz w:val="24"/>
-                      <w:szCs w:val="24"/>
-                    </w:rPr>
-                  </w:pPr>
-                  <w:r>
-                    <w:rPr>
-                      <w:sz w:val="24"/>
-                      <w:szCs w:val="24"/>
-                    </w:rPr>
-                    <w:t>Restoration Charges</w:t>
+                  <w:r>
+                    <w:rPr>
+                      <w:sz w:val="24"/>
+                      <w:szCs w:val="24"/>
+                    </w:rPr>
+                    <w:t>Other Deposits</w:t>
                   </w:r>
                 </w:p>
               </w:tc>
               <w:sdt>
                 <w:sdtPr>
-                  <w:alias w:val="#Nav: /FinalCalculation/Additional_Charges_Sub/Resto_Chrg"/>
+                  <w:alias w:val="#Nav: /FinalCalculation/Oth_De"/>
                   <w:tag w:val="#Nav: Termination_Template/50113"/>
-                  <w:id w:val="-2086294767"/>
+                  <w:id w:val="-29882543"/>
                   <w:placeholder>
                     <w:docPart w:val="DefaultPlaceholder_-1854013440"/>
                   </w:placeholder>
-                  <w:dataBinding w:prefixMappings="xmlns:ns0='urn:microsoft-dynamics-nav/reports/Termination_Template/50113/'" w:xpath="/ns0:NavWordReportXmlPart[1]/ns0:FinalCalculation[1]/ns0:Additional_Charges_Sub[1]/ns0:Resto_Chrg[1]" w:storeItemID="{5BBF7251-B33A-47F9-BAE4-7493B14D6FF8}"/>
+                  <w:dataBinding w:prefixMappings="xmlns:ns0='urn:microsoft-dynamics-nav/reports/Termination_Template/50113/'" w:xpath="/ns0:NavWordReportXmlPart[1]/ns0:FinalCalculation[1]/ns0:Oth_De[1]" w:storeItemID="{5BBF7251-B33A-47F9-BAE4-7493B14D6FF8}"/>
                   <w:text/>
                 </w:sdtPr>
                 <w:sdtContent>
                   <w:tc>
                     <w:tcPr>
-                      <w:tcW w:w="1665" w:type="dxa"/>
-                      <w:gridSpan w:val="2"/>
+                      <w:tcW w:w="1701" w:type="dxa"/>
                       <w:tcBorders>
                         <w:top w:val="nil"/>
                         <w:bottom w:val="nil"/>
@@ -2651,69 +2696,9 @@
                       <w:pPr>
                         <w:jc w:val="right"/>
                       </w:pPr>
-                      <w:proofErr w:type="spellStart"/>
                       <w:r>
-                        <w:t>Resto_Chrg</w:t>
+                        <w:t>Oth_De</w:t>
                       </w:r>
-                      <w:proofErr w:type="spellEnd"/>
-                    </w:p>
-                  </w:tc>
-                </w:sdtContent>
-              </w:sdt>
-              <w:tc>
-                <w:tcPr>
-                  <w:tcW w:w="3948" w:type="dxa"/>
-                  <w:gridSpan w:val="4"/>
-                  <w:tcBorders>
-                    <w:top w:val="nil"/>
-                    <w:bottom w:val="nil"/>
-                  </w:tcBorders>
-                </w:tcPr>
-                <w:p>
-                  <w:pPr>
-                    <w:rPr>
-                      <w:sz w:val="24"/>
-                      <w:szCs w:val="24"/>
-                    </w:rPr>
-                  </w:pPr>
-                  <w:r>
-                    <w:rPr>
-                      <w:sz w:val="24"/>
-                      <w:szCs w:val="24"/>
-                    </w:rPr>
-                    <w:t>Net Balance of Security Deposit</w:t>
-                  </w:r>
-                </w:p>
-              </w:tc>
-              <w:sdt>
-                <w:sdtPr>
-                  <w:alias w:val="#Nav: /FinalCalculation/Net_Ba"/>
-                  <w:tag w:val="#Nav: Termination_Template/50113"/>
-                  <w:id w:val="-1896727234"/>
-                  <w:placeholder>
-                    <w:docPart w:val="DefaultPlaceholder_-1854013440"/>
-                  </w:placeholder>
-                  <w:dataBinding w:prefixMappings="xmlns:ns0='urn:microsoft-dynamics-nav/reports/Termination_Template/50113/'" w:xpath="/ns0:NavWordReportXmlPart[1]/ns0:FinalCalculation[1]/ns0:Net_Ba[1]" w:storeItemID="{5BBF7251-B33A-47F9-BAE4-7493B14D6FF8}"/>
-                  <w:text/>
-                </w:sdtPr>
-                <w:sdtContent>
-                  <w:tc>
-                    <w:tcPr>
-                      <w:tcW w:w="1475" w:type="dxa"/>
-                      <w:tcBorders>
-                        <w:top w:val="nil"/>
-                        <w:bottom w:val="nil"/>
-                      </w:tcBorders>
-                    </w:tcPr>
-                    <w:p>
-                      <w:pPr>
-                        <w:jc w:val="right"/>
-                      </w:pPr>
-                      <w:proofErr w:type="spellStart"/>
-                      <w:r>
-                        <w:t>Net_Ba</w:t>
-                      </w:r>
-                      <w:proofErr w:type="spellEnd"/>
                     </w:p>
                   </w:tc>
                 </w:sdtContent>
@@ -2725,108 +2710,8 @@
               </w:trPr>
               <w:tc>
                 <w:tcPr>
-                  <w:tcW w:w="4106" w:type="dxa"/>
-                  <w:gridSpan w:val="3"/>
-                  <w:tcBorders>
-                    <w:top w:val="nil"/>
-                    <w:bottom w:val="nil"/>
-                  </w:tcBorders>
-                </w:tcPr>
-                <w:p>
-                  <w:pPr>
-                    <w:rPr>
-                      <w:b/>
-                      <w:bCs/>
-                    </w:rPr>
-                  </w:pPr>
-                </w:p>
-              </w:tc>
-              <w:tc>
-                <w:tcPr>
-                  <w:tcW w:w="1665" w:type="dxa"/>
-                  <w:gridSpan w:val="2"/>
-                  <w:tcBorders>
-                    <w:top w:val="nil"/>
-                    <w:bottom w:val="nil"/>
-                  </w:tcBorders>
-                </w:tcPr>
-                <w:p>
-                  <w:pPr>
-                    <w:jc w:val="right"/>
-                    <w:rPr>
-                      <w:b/>
-                      <w:bCs/>
-                    </w:rPr>
-                  </w:pPr>
-                </w:p>
-              </w:tc>
-              <w:tc>
-                <w:tcPr>
-                  <w:tcW w:w="3948" w:type="dxa"/>
-                  <w:gridSpan w:val="4"/>
-                  <w:tcBorders>
-                    <w:top w:val="nil"/>
-                    <w:bottom w:val="nil"/>
-                  </w:tcBorders>
-                </w:tcPr>
-                <w:p>
-                  <w:pPr>
-                    <w:rPr>
-                      <w:sz w:val="24"/>
-                      <w:szCs w:val="24"/>
-                    </w:rPr>
-                  </w:pPr>
-                  <w:r>
-                    <w:rPr>
-                      <w:sz w:val="24"/>
-                      <w:szCs w:val="24"/>
-                    </w:rPr>
-                    <w:t>Other Deposits</w:t>
-                  </w:r>
-                </w:p>
-              </w:tc>
-              <w:sdt>
-                <w:sdtPr>
-                  <w:alias w:val="#Nav: /FinalCalculation/Oth_De"/>
-                  <w:tag w:val="#Nav: Termination_Template/50113"/>
-                  <w:id w:val="-586537844"/>
-                  <w:placeholder>
-                    <w:docPart w:val="DefaultPlaceholder_-1854013440"/>
-                  </w:placeholder>
-                  <w:dataBinding w:prefixMappings="xmlns:ns0='urn:microsoft-dynamics-nav/reports/Termination_Template/50113/'" w:xpath="/ns0:NavWordReportXmlPart[1]/ns0:FinalCalculation[1]/ns0:Oth_De[1]" w:storeItemID="{5BBF7251-B33A-47F9-BAE4-7493B14D6FF8}"/>
-                  <w:text/>
-                </w:sdtPr>
-                <w:sdtContent>
-                  <w:tc>
-                    <w:tcPr>
-                      <w:tcW w:w="1475" w:type="dxa"/>
-                      <w:tcBorders>
-                        <w:top w:val="nil"/>
-                        <w:bottom w:val="nil"/>
-                      </w:tcBorders>
-                    </w:tcPr>
-                    <w:p>
-                      <w:pPr>
-                        <w:jc w:val="right"/>
-                      </w:pPr>
-                      <w:proofErr w:type="spellStart"/>
-                      <w:r>
-                        <w:t>Oth_De</w:t>
-                      </w:r>
-                      <w:proofErr w:type="spellEnd"/>
-                    </w:p>
-                  </w:tc>
-                </w:sdtContent>
-              </w:sdt>
-            </w:tr>
-            <w:tr>
-              <w:trPr>
-                <w:trHeight w:val="276"/>
-              </w:trPr>
-              <w:tc>
-                <w:tcPr>
-                  <w:tcW w:w="4106" w:type="dxa"/>
-                  <w:gridSpan w:val="3"/>
+                  <w:tcW w:w="9493" w:type="dxa"/>
+                  <w:gridSpan w:val="7"/>
                   <w:tcBorders>
                     <w:top w:val="nil"/>
                     <w:bottom w:val="single" w:color="auto" w:sz="4" w:space="0"/>
@@ -2856,20 +2741,19 @@
                     <w:b/>
                     <w:bCs/>
                   </w:rPr>
-                  <w:alias w:val="#Nav: /FinalCalculation/Additional_Charges_Sub/T_Add_Chrg"/>
+                  <w:alias w:val="#Nav: /FinalCalculation/T_Deposit"/>
                   <w:tag w:val="#Nav: Termination_Template/50113"/>
-                  <w:id w:val="493145448"/>
+                  <w:id w:val="773136175"/>
                   <w:placeholder>
                     <w:docPart w:val="DefaultPlaceholder_-1854013440"/>
                   </w:placeholder>
-                  <w:dataBinding w:prefixMappings="xmlns:ns0='urn:microsoft-dynamics-nav/reports/Termination_Template/50113/'" w:xpath="/ns0:NavWordReportXmlPart[1]/ns0:FinalCalculation[1]/ns0:Additional_Charges_Sub[1]/ns0:T_Add_Chrg[1]" w:storeItemID="{5BBF7251-B33A-47F9-BAE4-7493B14D6FF8}"/>
+                  <w:dataBinding w:prefixMappings="xmlns:ns0='urn:microsoft-dynamics-nav/reports/Termination_Template/50113/'" w:xpath="/ns0:NavWordReportXmlPart[1]/ns0:FinalCalculation[1]/ns0:T_Deposit[1]" w:storeItemID="{5BBF7251-B33A-47F9-BAE4-7493B14D6FF8}"/>
                   <w:text/>
                 </w:sdtPr>
                 <w:sdtContent>
                   <w:tc>
                     <w:tcPr>
-                      <w:tcW w:w="1665" w:type="dxa"/>
-                      <w:gridSpan w:val="2"/>
+                      <w:tcW w:w="1701" w:type="dxa"/>
                       <w:tcBorders>
                         <w:top w:val="nil"/>
                         <w:bottom w:val="single" w:color="auto" w:sz="4" w:space="0"/>
@@ -2883,79 +2767,6 @@
                           <w:bCs/>
                         </w:rPr>
                       </w:pPr>
-                      <w:proofErr w:type="spellStart"/>
-                      <w:r>
-                        <w:rPr>
-                          <w:b/>
-                          <w:bCs/>
-                        </w:rPr>
-                        <w:t>T_Add_Chrg</w:t>
-                      </w:r>
-                      <w:proofErr w:type="spellEnd"/>
-                    </w:p>
-                  </w:tc>
-                </w:sdtContent>
-              </w:sdt>
-              <w:tc>
-                <w:tcPr>
-                  <w:tcW w:w="3948" w:type="dxa"/>
-                  <w:gridSpan w:val="4"/>
-                  <w:tcBorders>
-                    <w:top w:val="nil"/>
-                    <w:bottom w:val="single" w:color="auto" w:sz="4" w:space="0"/>
-                  </w:tcBorders>
-                </w:tcPr>
-                <w:p>
-                  <w:pPr>
-                    <w:rPr>
-                      <w:b/>
-                      <w:bCs/>
-                    </w:rPr>
-                  </w:pPr>
-                  <w:r>
-                    <w:rPr>
-                      <w:b/>
-                      <w:bCs/>
-                      <w:sz w:val="24"/>
-                      <w:szCs w:val="24"/>
-                    </w:rPr>
-                    <w:t>Total</w:t>
-                  </w:r>
-                </w:p>
-              </w:tc>
-              <w:sdt>
-                <w:sdtPr>
-                  <w:rPr>
-                    <w:b/>
-                    <w:bCs/>
-                  </w:rPr>
-                  <w:alias w:val="#Nav: /FinalCalculation/T_Deposit"/>
-                  <w:tag w:val="#Nav: Termination_Template/50113"/>
-                  <w:id w:val="-1623297069"/>
-                  <w:placeholder>
-                    <w:docPart w:val="DefaultPlaceholder_-1854013440"/>
-                  </w:placeholder>
-                  <w:dataBinding w:prefixMappings="xmlns:ns0='urn:microsoft-dynamics-nav/reports/Termination_Template/50113/'" w:xpath="/ns0:NavWordReportXmlPart[1]/ns0:FinalCalculation[1]/ns0:T_Deposit[1]" w:storeItemID="{5BBF7251-B33A-47F9-BAE4-7493B14D6FF8}"/>
-                  <w:text/>
-                </w:sdtPr>
-                <w:sdtContent>
-                  <w:tc>
-                    <w:tcPr>
-                      <w:tcW w:w="1475" w:type="dxa"/>
-                      <w:tcBorders>
-                        <w:top w:val="nil"/>
-                        <w:bottom w:val="single" w:color="auto" w:sz="4" w:space="0"/>
-                      </w:tcBorders>
-                    </w:tcPr>
-                    <w:p>
-                      <w:pPr>
-                        <w:jc w:val="right"/>
-                        <w:rPr>
-                          <w:b/>
-                          <w:bCs/>
-                        </w:rPr>
-                      </w:pPr>
-                      <w:proofErr w:type="spellStart"/>
                       <w:r>
                         <w:rPr>
                           <w:b/>
@@ -2963,7 +2774,6 @@
                         </w:rPr>
                         <w:t>T_Deposit</w:t>
                       </w:r>
-                      <w:proofErr w:type="spellEnd"/>
                     </w:p>
                   </w:tc>
                 </w:sdtContent>
@@ -2976,7 +2786,7 @@
               <w:tc>
                 <w:tcPr>
                   <w:tcW w:w="11194" w:type="dxa"/>
-                  <w:gridSpan w:val="10"/>
+                  <w:gridSpan w:val="8"/>
                   <w:tcBorders>
                     <w:top w:val="single" w:color="auto" w:sz="4" w:space="0"/>
                     <w:bottom w:val="single" w:color="auto" w:sz="4" w:space="0"/>
@@ -3065,7 +2875,7 @@
                         <w:tag w:val="#Nav: Termination_Template/50113"/>
                         <w:id w:val="408046063"/>
                         <w:placeholder>
-                          <w:docPart w:val="DefaultPlaceholder_-1854013440"/>
+                          <w:docPart w:val="5552720317A9464DB93762096A3F3B9F"/>
                         </w:placeholder>
                         <w:dataBinding w:prefixMappings="xmlns:ns0='urn:microsoft-dynamics-nav/reports/Termination_Template/50113/'" w:xpath="/ns0:NavWordReportXmlPart[1]/ns0:FinalCalculation[1]/ns0:Pending_Receviable_Grid[1]/ns0:Rent_BP[1]" w:storeItemID="{5BBF7251-B33A-47F9-BAE4-7493B14D6FF8}"/>
                         <w:text/>
@@ -3087,7 +2897,6 @@
                                 <w:szCs w:val="24"/>
                               </w:rPr>
                             </w:pPr>
-                            <w:proofErr w:type="spellStart"/>
                             <w:r>
                               <w:rPr>
                                 <w:sz w:val="24"/>
@@ -3095,7 +2904,6 @@
                               </w:rPr>
                               <w:t>Rent_BP</w:t>
                             </w:r>
-                            <w:proofErr w:type="spellEnd"/>
                           </w:p>
                         </w:tc>
                       </w:sdtContent>
@@ -3139,7 +2947,7 @@
                         <w:tag w:val="#Nav: Termination_Template/50113"/>
                         <w:id w:val="-746651804"/>
                         <w:placeholder>
-                          <w:docPart w:val="DefaultPlaceholder_-1854013440"/>
+                          <w:docPart w:val="5552720317A9464DB93762096A3F3B9F"/>
                         </w:placeholder>
                         <w:dataBinding w:prefixMappings="xmlns:ns0='urn:microsoft-dynamics-nav/reports/Termination_Template/50113/'" w:xpath="/ns0:NavWordReportXmlPart[1]/ns0:FinalCalculation[1]/ns0:TIR_TRAIV[1]" w:storeItemID="{5BBF7251-B33A-47F9-BAE4-7493B14D6FF8}"/>
                         <w:text/>
@@ -3207,14 +3015,14 @@
                           <w:sz w:val="24"/>
                           <w:szCs w:val="24"/>
                         </w:rPr>
-                        <w:alias w:val="#Nav: /FinalCalculation/Additional_Charges_Sub/T_Add_Chrg"/>
-                        <w:tag w:val="#Nav: Termination_Template/50113"/>
-                        <w:id w:val="-1375156774"/>
+                        <w:id w:val="931016505"/>
                         <w:placeholder>
                           <w:docPart w:val="DefaultPlaceholder_-1854013440"/>
                         </w:placeholder>
-                        <w:dataBinding w:prefixMappings="xmlns:ns0='urn:microsoft-dynamics-nav/reports/Termination_Template/50113/'" w:xpath="/ns0:NavWordReportXmlPart[1]/ns0:FinalCalculation[1]/ns0:Additional_Charges_Sub[1]/ns0:T_Add_Chrg[1]" w:storeItemID="{5BBF7251-B33A-47F9-BAE4-7493B14D6FF8}"/>
+                        <w:dataBinding w:prefixMappings="xmlns:ns0='urn:microsoft-dynamics-nav/reports/Termination_Template/50113/'" w:xpath="/ns0:NavWordReportXmlPart[1]/ns0:FinalCalculation[1]/ns0:Total_AdC[1]" w:storeItemID="{5BBF7251-B33A-47F9-BAE4-7493B14D6FF8}"/>
                         <w:text/>
+                        <w:alias w:val="#Nav: /FinalCalculation/Total_AdC"/>
+                        <w:tag w:val="#Nav: Termination_Template/50113"/>
                       </w:sdtPr>
                       <w:sdtContent>
                         <w:tc>
@@ -3233,15 +3041,13 @@
                                 <w:szCs w:val="24"/>
                               </w:rPr>
                             </w:pPr>
-                            <w:proofErr w:type="spellStart"/>
                             <w:r>
                               <w:rPr>
                                 <w:sz w:val="24"/>
                                 <w:szCs w:val="24"/>
                               </w:rPr>
-                              <w:t>T_Add_Chrg</w:t>
+                              <w:t>Total_AdC</w:t>
                             </w:r>
-                            <w:proofErr w:type="spellEnd"/>
                           </w:p>
                         </w:tc>
                       </w:sdtContent>
@@ -3284,7 +3090,7 @@
                         <w:tag w:val="#Nav: Termination_Template/50113"/>
                         <w:id w:val="-1157918044"/>
                         <w:placeholder>
-                          <w:docPart w:val="DefaultPlaceholder_-1854013440"/>
+                          <w:docPart w:val="5552720317A9464DB93762096A3F3B9F"/>
                         </w:placeholder>
                         <w:dataBinding w:prefixMappings="xmlns:ns0='urn:microsoft-dynamics-nav/reports/Termination_Template/50113/'" w:xpath="/ns0:NavWordReportXmlPart[1]/ns0:FinalCalculation[1]/ns0:T_RE_Deposit[1]" w:storeItemID="{5BBF7251-B33A-47F9-BAE4-7493B14D6FF8}"/>
                         <w:text/>
@@ -3305,7 +3111,6 @@
                                 <w:szCs w:val="24"/>
                               </w:rPr>
                             </w:pPr>
-                            <w:proofErr w:type="spellStart"/>
                             <w:r>
                               <w:rPr>
                                 <w:sz w:val="24"/>
@@ -3313,7 +3118,6 @@
                               </w:rPr>
                               <w:t>T_RE_Deposit</w:t>
                             </w:r>
-                            <w:proofErr w:type="spellEnd"/>
                           </w:p>
                         </w:tc>
                       </w:sdtContent>
@@ -3359,7 +3163,7 @@
                         <w:tag w:val="#Nav: Termination_Template/50113"/>
                         <w:id w:val="881529568"/>
                         <w:placeholder>
-                          <w:docPart w:val="DefaultPlaceholder_-1854013440"/>
+                          <w:docPart w:val="5552720317A9464DB93762096A3F3B9F"/>
                         </w:placeholder>
                         <w:dataBinding w:prefixMappings="xmlns:ns0='urn:microsoft-dynamics-nav/reports/Termination_Template/50113/'" w:xpath="/ns0:NavWordReportXmlPart[1]/ns0:FinalCalculation[1]/ns0:Total_Settlement[1]" w:storeItemID="{5BBF7251-B33A-47F9-BAE4-7493B14D6FF8}"/>
                         <w:text/>
@@ -3379,7 +3183,6 @@
                                 <w:szCs w:val="24"/>
                               </w:rPr>
                             </w:pPr>
-                            <w:proofErr w:type="spellStart"/>
                             <w:r>
                               <w:rPr>
                                 <w:b/>
@@ -3389,7 +3192,6 @@
                               </w:rPr>
                               <w:t>Total_Settlement</w:t>
                             </w:r>
-                            <w:proofErr w:type="spellEnd"/>
                           </w:p>
                         </w:tc>
                       </w:sdtContent>
@@ -3413,7 +3215,7 @@
               <w:tc>
                 <w:tcPr>
                   <w:tcW w:w="8018" w:type="dxa"/>
-                  <w:gridSpan w:val="7"/>
+                  <w:gridSpan w:val="6"/>
                   <w:tcBorders>
                     <w:top w:val="single" w:color="auto" w:sz="4" w:space="0"/>
                     <w:bottom w:val="nil"/>
@@ -3436,54 +3238,7 @@
                       <w:sz w:val="24"/>
                       <w:szCs w:val="24"/>
                     </w:rPr>
-                    <w:t xml:space="preserve">                   </w:t>
-                  </w:r>
-                  <w:r>
-                    <w:rPr>
-                      <w:b/>
-                      <w:bCs/>
-                      <w:sz w:val="24"/>
-                      <w:szCs w:val="24"/>
-                    </w:rPr>
-                    <w:t>Final S</w:t>
-                  </w:r>
-                  <w:r>
-                    <w:rPr>
-                      <w:b/>
-                      <w:bCs/>
-                      <w:sz w:val="24"/>
-                      <w:szCs w:val="24"/>
-                    </w:rPr>
-                    <w:t>e</w:t>
-                  </w:r>
-                  <w:r>
-                    <w:rPr>
-                      <w:b/>
-                      <w:bCs/>
-                      <w:sz w:val="24"/>
-                      <w:szCs w:val="24"/>
-                    </w:rPr>
-                    <w:t xml:space="preserve">ttlement </w:t>
-                  </w:r>
-                  <w:proofErr w:type="gramStart"/>
-                  <w:r>
-                    <w:rPr>
-                      <w:b/>
-                      <w:bCs/>
-                      <w:sz w:val="24"/>
-                      <w:szCs w:val="24"/>
-                    </w:rPr>
-                    <w:t>Pay :</w:t>
-                  </w:r>
-                  <w:proofErr w:type="gramEnd"/>
-                  <w:r>
-                    <w:rPr>
-                      <w:b/>
-                      <w:bCs/>
-                      <w:sz w:val="24"/>
-                      <w:szCs w:val="24"/>
-                    </w:rPr>
-                    <w:t xml:space="preserve"> </w:t>
+                    <w:t xml:space="preserve">                   Final Settlement Pay : </w:t>
                   </w:r>
                   <w:sdt>
                     <w:sdtPr>
@@ -3497,13 +3252,12 @@
                       <w:tag w:val="#Nav: Termination_Template/50113"/>
                       <w:id w:val="158199766"/>
                       <w:placeholder>
-                        <w:docPart w:val="DefaultPlaceholder_-1854013440"/>
+                        <w:docPart w:val="5552720317A9464DB93762096A3F3B9F"/>
                       </w:placeholder>
                       <w:dataBinding w:prefixMappings="xmlns:ns0='urn:microsoft-dynamics-nav/reports/Termination_Template/50113/'" w:xpath="/ns0:NavWordReportXmlPart[1]/ns0:FinalCalculation[1]/ns0:Final_Settlement[1]" w:storeItemID="{5BBF7251-B33A-47F9-BAE4-7493B14D6FF8}"/>
                       <w:text/>
                     </w:sdtPr>
                     <w:sdtContent>
-                      <w:proofErr w:type="spellStart"/>
                       <w:r>
                         <w:rPr>
                           <w:b/>
@@ -3513,7 +3267,6 @@
                         </w:rPr>
                         <w:t>Final_Settlement</w:t>
                       </w:r>
-                      <w:proofErr w:type="spellEnd"/>
                     </w:sdtContent>
                   </w:sdt>
                 </w:p>
@@ -3521,7 +3274,7 @@
               <w:tc>
                 <w:tcPr>
                   <w:tcW w:w="3176" w:type="dxa"/>
-                  <w:gridSpan w:val="3"/>
+                  <w:gridSpan w:val="2"/>
                   <w:tcBorders>
                     <w:top w:val="single" w:color="auto" w:sz="4" w:space="0"/>
                     <w:left w:val="nil"/>
@@ -3537,34 +3290,14 @@
                       <w:szCs w:val="24"/>
                     </w:rPr>
                   </w:pPr>
-                  <w:proofErr w:type="gramStart"/>
-                  <w:r>
-                    <w:rPr>
-                      <w:b/>
-                      <w:bCs/>
-                      <w:sz w:val="24"/>
-                      <w:szCs w:val="24"/>
-                    </w:rPr>
-                    <w:t>Status :</w:t>
-                  </w:r>
-                  <w:proofErr w:type="gramEnd"/>
-                  <w:r>
-                    <w:rPr>
-                      <w:b/>
-                      <w:bCs/>
-                      <w:sz w:val="24"/>
-                      <w:szCs w:val="24"/>
-                    </w:rPr>
-                    <w:t xml:space="preserve"> </w:t>
-                  </w:r>
-                  <w:r>
-                    <w:rPr>
-                      <w:b/>
-                      <w:bCs/>
-                      <w:sz w:val="24"/>
-                      <w:szCs w:val="24"/>
-                    </w:rPr>
-                    <w:t>Refund</w:t>
+                  <w:r>
+                    <w:rPr>
+                      <w:b/>
+                      <w:bCs/>
+                      <w:sz w:val="24"/>
+                      <w:szCs w:val="24"/>
+                    </w:rPr>
+                    <w:t>Status : Refund</w:t>
                   </w:r>
                 </w:p>
               </w:tc>
@@ -3576,7 +3309,7 @@
               <w:tc>
                 <w:tcPr>
                   <w:tcW w:w="11194" w:type="dxa"/>
-                  <w:gridSpan w:val="10"/>
+                  <w:gridSpan w:val="8"/>
                   <w:tcBorders>
                     <w:top w:val="nil"/>
                     <w:bottom w:val="nil"/>
@@ -3598,36 +3331,7 @@
                       <w:sz w:val="24"/>
                       <w:szCs w:val="24"/>
                     </w:rPr>
-                    <w:t xml:space="preserve">                   </w:t>
-                  </w:r>
-                  <w:r>
-                    <w:rPr>
-                      <w:b/>
-                      <w:bCs/>
-                      <w:sz w:val="24"/>
-                      <w:szCs w:val="24"/>
-                    </w:rPr>
-                    <w:t xml:space="preserve">Amount in </w:t>
-                  </w:r>
-                  <w:proofErr w:type="gramStart"/>
-                  <w:r>
-                    <w:rPr>
-                      <w:b/>
-                      <w:bCs/>
-                      <w:sz w:val="24"/>
-                      <w:szCs w:val="24"/>
-                    </w:rPr>
-                    <w:t>Words :</w:t>
-                  </w:r>
-                  <w:proofErr w:type="gramEnd"/>
-                  <w:r>
-                    <w:rPr>
-                      <w:b/>
-                      <w:bCs/>
-                      <w:sz w:val="24"/>
-                      <w:szCs w:val="24"/>
-                    </w:rPr>
-                    <w:t xml:space="preserve"> </w:t>
+                    <w:t xml:space="preserve">                   Amount in Words : </w:t>
                   </w:r>
                   <w:sdt>
                     <w:sdtPr>
@@ -3635,17 +3339,16 @@
                         <w:sz w:val="24"/>
                         <w:szCs w:val="24"/>
                       </w:rPr>
+                      <w:alias w:val="#Nav: /FinalCalculation/Final_Settlement_Words"/>
+                      <w:tag w:val="#Nav: Termination_Template/50113"/>
                       <w:id w:val="-777175452"/>
                       <w:placeholder>
-                        <w:docPart w:val="DefaultPlaceholder_-1854013440"/>
+                        <w:docPart w:val="5552720317A9464DB93762096A3F3B9F"/>
                       </w:placeholder>
                       <w:dataBinding w:prefixMappings="xmlns:ns0='urn:microsoft-dynamics-nav/reports/Termination_Template/50113/'" w:xpath="/ns0:NavWordReportXmlPart[1]/ns0:FinalCalculation[1]/ns0:Final_Settlement_Words[1]" w:storeItemID="{5BBF7251-B33A-47F9-BAE4-7493B14D6FF8}"/>
                       <w:text/>
-                      <w:alias w:val="#Nav: /FinalCalculation/Final_Settlement_Words"/>
-                      <w:tag w:val="#Nav: Termination_Template/50113"/>
                     </w:sdtPr>
                     <w:sdtContent>
-                      <w:proofErr w:type="spellStart"/>
                       <w:r>
                         <w:rPr>
                           <w:sz w:val="24"/>
@@ -3653,7 +3356,6 @@
                         </w:rPr>
                         <w:t>Final_Settlement_Words</w:t>
                       </w:r>
-                      <w:proofErr w:type="spellEnd"/>
                     </w:sdtContent>
                   </w:sdt>
                 </w:p>
@@ -3666,7 +3368,7 @@
               <w:tc>
                 <w:tcPr>
                   <w:tcW w:w="11194" w:type="dxa"/>
-                  <w:gridSpan w:val="10"/>
+                  <w:gridSpan w:val="8"/>
                   <w:tcBorders>
                     <w:top w:val="nil"/>
                     <w:bottom w:val="single" w:color="auto" w:sz="4" w:space="0"/>
@@ -4320,7 +4022,7 @@
     </w:docPart>
     <w:docPart>
       <w:docPartPr>
-        <w:name w:val="77E3EFD32F06411A94A583EAE440DB2A"/>
+        <w:name w:val="C59D612139C1488BB38C15339E917EED"/>
         <w:category>
           <w:name w:val="General"/>
           <w:gallery w:val="placeholder"/>
@@ -4331,12 +4033,41 @@
         <w:behaviors>
           <w:behavior w:val="content"/>
         </w:behaviors>
-        <w:guid w:val="{3139E381-28B3-4575-9686-9056E9A67124}"/>
+        <w:guid w:val="{B3CF2C8C-3C63-4786-84C6-B8872D9FFE54}"/>
       </w:docPartPr>
       <w:docPartBody>
         <w:p>
           <w:pPr>
-            <w:pStyle w:val="77E3EFD32F06411A94A583EAE440DB2A"/>
+            <w:pStyle w:val="C59D612139C1488BB38C15339E917EED"/>
+          </w:pPr>
+          <w:r>
+            <w:rPr>
+              <w:rStyle w:val="PlaceholderText"/>
+            </w:rPr>
+            <w:t>Click or tap here to enter text.</w:t>
+          </w:r>
+        </w:p>
+      </w:docPartBody>
+    </w:docPart>
+    <w:docPart>
+      <w:docPartPr>
+        <w:name w:val="5552720317A9464DB93762096A3F3B9F"/>
+        <w:category>
+          <w:name w:val="General"/>
+          <w:gallery w:val="placeholder"/>
+        </w:category>
+        <w:types>
+          <w:type w:val="bbPlcHdr"/>
+        </w:types>
+        <w:behaviors>
+          <w:behavior w:val="content"/>
+        </w:behaviors>
+        <w:guid w:val="{74E93A5D-07D0-4A42-920D-F5006AD30EBF}"/>
+      </w:docPartPr>
+      <w:docPartBody>
+        <w:p>
+          <w:pPr>
+            <w:pStyle w:val="5552720317A9464DB93762096A3F3B9F"/>
           </w:pPr>
           <w:r>
             <w:rPr>
@@ -4394,6 +4125,7 @@
   <w:rsids>
     <w:rsidRoot w:val="009E7335"/>
     <w:rsid w:val="000A45D0"/>
+    <w:rsid w:val="000A4A46"/>
     <w:rsid w:val="000C4417"/>
     <w:rsid w:val="000F0324"/>
     <w:rsid w:val="00100002"/>
@@ -4410,8 +4142,12 @@
     <w:rsid w:val="0041670D"/>
     <w:rsid w:val="00457CE0"/>
     <w:rsid w:val="0049027D"/>
+    <w:rsid w:val="00490FA6"/>
+    <w:rsid w:val="004D1F93"/>
+    <w:rsid w:val="004F3A82"/>
     <w:rsid w:val="0050148A"/>
     <w:rsid w:val="005409D7"/>
+    <w:rsid w:val="0055616F"/>
     <w:rsid w:val="00581AB4"/>
     <w:rsid w:val="00595B47"/>
     <w:rsid w:val="005A6A03"/>
@@ -4420,12 +4156,15 @@
     <w:rsid w:val="00662181"/>
     <w:rsid w:val="00670B4D"/>
     <w:rsid w:val="0067157B"/>
+    <w:rsid w:val="0067753D"/>
     <w:rsid w:val="006F0F74"/>
     <w:rsid w:val="00712249"/>
     <w:rsid w:val="00747C13"/>
     <w:rsid w:val="00766535"/>
     <w:rsid w:val="0078736F"/>
     <w:rsid w:val="00790A96"/>
+    <w:rsid w:val="007B73F0"/>
+    <w:rsid w:val="007B748F"/>
     <w:rsid w:val="007D5AB0"/>
     <w:rsid w:val="007E1F97"/>
     <w:rsid w:val="007E3BD2"/>
@@ -4433,13 +4172,17 @@
     <w:rsid w:val="00854A9F"/>
     <w:rsid w:val="00863703"/>
     <w:rsid w:val="008B47B5"/>
+    <w:rsid w:val="008B62BE"/>
+    <w:rsid w:val="009067ED"/>
     <w:rsid w:val="0092781B"/>
     <w:rsid w:val="00950C4A"/>
     <w:rsid w:val="00954BC8"/>
+    <w:rsid w:val="00954F6C"/>
     <w:rsid w:val="009628F2"/>
     <w:rsid w:val="009D7622"/>
     <w:rsid w:val="009E51EA"/>
     <w:rsid w:val="009E7335"/>
+    <w:rsid w:val="00A35165"/>
     <w:rsid w:val="00A75084"/>
     <w:rsid w:val="00AA51D4"/>
     <w:rsid w:val="00AD5615"/>
@@ -4449,15 +4192,21 @@
     <w:rsid w:val="00B721DA"/>
     <w:rsid w:val="00BA44EB"/>
     <w:rsid w:val="00BC1548"/>
+    <w:rsid w:val="00C15AC7"/>
     <w:rsid w:val="00C75BD0"/>
     <w:rsid w:val="00C937D5"/>
+    <w:rsid w:val="00C9479E"/>
     <w:rsid w:val="00CC052E"/>
     <w:rsid w:val="00DA6587"/>
     <w:rsid w:val="00E12D64"/>
+    <w:rsid w:val="00E31517"/>
     <w:rsid w:val="00EC3869"/>
+    <w:rsid w:val="00EE61A0"/>
+    <w:rsid w:val="00EF3129"/>
     <w:rsid w:val="00F0479B"/>
     <w:rsid w:val="00F63550"/>
     <w:rsid w:val="00FC1634"/>
+    <w:rsid w:val="00FE4A67"/>
   </w:rsids>
   <m:mathPr>
     <m:mathFont m:val="Cambria Math"/>
@@ -4913,14 +4662,18 @@
     <w:basedOn w:val="DefaultParagraphFont"/>
     <w:uiPriority w:val="99"/>
     <w:semiHidden/>
-    <w:rsid w:val="00766535"/>
+    <w:rsid w:val="007B748F"/>
     <w:rPr>
       <w:color w:val="666666"/>
     </w:rPr>
   </w:style>
-  <w:style w:type="paragraph" w:customStyle="1" w:styleId="77E3EFD32F06411A94A583EAE440DB2A">
-    <w:name w:val="77E3EFD32F06411A94A583EAE440DB2A"/>
-    <w:rsid w:val="00766535"/>
+  <w:style w:type="paragraph" w:customStyle="1" w:styleId="C59D612139C1488BB38C15339E917EED">
+    <w:name w:val="C59D612139C1488BB38C15339E917EED"/>
+    <w:rsid w:val="00FE4A67"/>
+  </w:style>
+  <w:style w:type="paragraph" w:customStyle="1" w:styleId="5552720317A9464DB93762096A3F3B9F">
+    <w:name w:val="5552720317A9464DB93762096A3F3B9F"/>
+    <w:rsid w:val="007B748F"/>
   </w:style>
 </w:styles>
 </file>
@@ -5227,7 +4980,11 @@
 </a:theme>
 </file>
 
-<file path=customXml/item1.xml>��< ? x m l   v e r s i o n = " 1 . 0 "   e n c o d i n g = " u t f - 1 6 " ? > < N a v W o r d R e p o r t X m l P a r t   x m l n s = " u r n : m i c r o s o f t - d y n a m i c s - n a v / r e p o r t s / T e r m i n a t i o n _ T e m p l a t e / 5 0 1 1 3 / " > +<file path=customXml/item1.xml><?xml version="1.0" encoding="utf-8"?>
+<b:Sources xmlns:b="http://schemas.openxmlformats.org/officeDocument/2006/bibliography" xmlns="http://schemas.openxmlformats.org/officeDocument/2006/bibliography" SelectedStyle="\APASixthEditionOfficeOnline.xsl" StyleName="APA" Version="6"/>
+</file>
+
+<file path=customXml/item2.xml>��< ? x m l   v e r s i o n = " 1 . 0 "   e n c o d i n g = " u t f - 1 6 " ? > < N a v W o r d R e p o r t X m l P a r t   x m l n s = " u r n : m i c r o s o f t - d y n a m i c s - n a v / r e p o r t s / T e r m i n a t i o n _ T e m p l a t e / 5 0 1 1 3 / " >   
      < F i n a l C a l c u l a t i o n >   
@@ -5251,6 +5008,8 @@
  
          < C o m p a n y P o s t c o d e > C o m p a n y P o s t c o d e < / C o m p a n y P o s t c o d e >   
+         < C o m p a n y T R N > C o m p a n y T R N < / C o m p a n y T R N > + 
          < C o n t r a c t _ E n d _ D a t e > C o n t r a c t _ E n d _ D a t e < / C o n t r a c t _ E n d _ D a t e >   
          < C o n t r a c t _ I D > C o n t r a c t _ I D < / C o n t r a c t _ I D > @@ -5277,6 +5036,8 @@
  
          < T I R _ T R A I V > T I R _ T R A I V < / T I R _ T R A I V >   
+         < T o t a l _ A d C > T o t a l _ A d C < / T o t a l _ A d C > + 
          < T o t a l _ S e t t l e m e n t > T o t a l _ S e t t l e m e n t < / T o t a l _ S e t t l e m e n t >   
          < T R A _ I V > T R A _ I V < / T R A _ I V > @@ -5297,6 +5058,8 @@
  
              < P h o n e _ N o _ > P h o n e _ N o _ < / P h o n e _ N o _ >   
+             < V A T _ R e g i s t r a t i o n _ N o _ > V A T _ R e g i s t r a t i o n _ N o _ < / V A T _ R e g i s t r a t i o n _ N o _ > + 
          < / C u s t o m e r >   
          < T e n a n c y _ C o n t r a c t > @@ -5337,13 +5100,9 @@
  
          < A d d i t i o n a l _ C h a r g e s _ S u b >   
-             < E a r l y _ T _ F > E a r l y _ T _ F < / E a r l y _ T _ F > - 
-             < L a t e _ I _ F > L a t e _ I _ F < / L a t e _ I _ F > - 
-             < R e s t o _ C h r g > R e s t o _ C h r g < / R e s t o _ C h r g > - 
-             < T _ A d d _ C h r g > T _ A d d _ C h r g < / T _ A d d _ C h r g > +             < A m o u n t _ I V > A m o u n t _ I V < / A m o u n t _ I V > + 
+             < S e c o n d a r y _ I t e m _ T y p e > S e c o n d a r y _ I t e m _ T y p e < / S e c o n d a r y _ I t e m _ T y p e >   
          < / A d d i t i o n a l _ C h a r g e s _ S u b >   
@@ -5352,22 +5111,18 @@
  < / N a v W o r d R e p o r t X m l P a r t > 
 </file>
 
-<file path=customXml/item2.xml><?xml version="1.0" encoding="utf-8"?>
-<b:Sources xmlns:b="http://schemas.openxmlformats.org/officeDocument/2006/bibliography" xmlns="http://schemas.openxmlformats.org/officeDocument/2006/bibliography" SelectedStyle="\APASixthEditionOfficeOnline.xsl" StyleName="APA" Version="6"/>
+<file path=customXml/itemProps1.xml><?xml version="1.0" encoding="utf-8"?>
+<ds:datastoreItem xmlns:ds="http://schemas.openxmlformats.org/officeDocument/2006/customXml" ds:itemID="{1BD6C9D7-A217-49ED-A334-79F0FD9DA1BF}">
+  <ds:schemaRefs>
+    <ds:schemaRef ds:uri="http://schemas.openxmlformats.org/officeDocument/2006/bibliography"/>
+  </ds:schemaRefs>
+</ds:datastoreItem>
 </file>
 
-<file path=customXml/itemProps1.xml><?xml version="1.0" encoding="utf-8"?>
+<file path=customXml/itemProps2.xml><?xml version="1.0" encoding="utf-8"?>
 <ds:datastoreItem xmlns:ds="http://schemas.openxmlformats.org/officeDocument/2006/customXml" ds:itemID="{5BBF7251-B33A-47F9-BAE4-7493B14D6FF8}">
   <ds:schemaRefs>
     <ds:schemaRef ds:uri="urn:microsoft-dynamics-nav/reports/Termination_Template/50113/"/>
   </ds:schemaRefs>
 </ds:datastoreItem>
-</file>
-
-<file path=customXml/itemProps2.xml><?xml version="1.0" encoding="utf-8"?>
-<ds:datastoreItem xmlns:ds="http://schemas.openxmlformats.org/officeDocument/2006/customXml" ds:itemID="{1BD6C9D7-A217-49ED-A334-79F0FD9DA1BF}">
-  <ds:schemaRefs>
-    <ds:schemaRef ds:uri="http://schemas.openxmlformats.org/officeDocument/2006/bibliography"/>
-  </ds:schemaRefs>
-</ds:datastoreItem>
 </file>
</xml_diff>